<commit_message>
Try to add weeks 73 to 89 to TDC website import
</commit_message>
<xml_diff>
--- a/Output/Vellum/week85_vellum.docx
+++ b/Output/Vellum/week85_vellum.docx
@@ -24,7 +24,7 @@
     <w:p>
       <w:pPr/>
       <w:r>
-        <w:t>This week combined symbolic spectacle with substantive institutional strain. Trump's petty renaming of Lake Ontario and AI-generated propaganda videos targeting Canada dominated headlines but masked deeper structural erosion: DHS's warrantless surveillance of journalists and unions via an obscure customs statute, a coordinated multi-agency effort (DOJ, DHS, USCIS, HSI) to scrutinize voter rolls and mail-in ballots weeks before midterms, and open threats from administration officials (Bannon, Mullin) about deploying ICE to polling places. The Pentagon experienced visible fracture—Army Secretary Driscoll's resignation, purges of senior officers, and covert hiring of partisan influencers—while military commanders formally dissented from Iran war policy. The Supreme Court allowed executive construction to proceed on procedural standing grounds, and DOJ blocked civil-rights prosecution of an ICE officer. Countervailing signals included judicial blocks on birthright citizenship restrictions and USPS ballot rules, and adverse midterm polling for Republicans.</w:t>
+        <w:t>This was a week defined by the normalization of surveillance-state tools against domestic targets, executive contempt for institutional constraint, and open warfare between the Pentagon's civilian leadership and its uniformed officers. DHS's use of obscure customs law (19 USC 1509) to secretly surveil journalists, unions, and non-profits—confirmed by congressional demands for a GAO probe—sat alongside a parallel effort to militarize election administration through HSI voter-fraud sweeps, USCIS reassignments, and a threatened ICE presence at polling places. The judiciary offered mixed signals: courts blocked a birthright-citizenship order and a flawed USPS ballot rule, but the Supreme Court let White House ballroom construction proceed on standing grounds over Roberts's dissent. Meanwhile Trump's Venezuela oil deal, Lake Ontario renaming stunt, and AI-fabricated war videos revealed a presidency increasingly untethered from factual and legal constraint, while Army Secretary Driscoll's resignation and open GOP senator criticism of Hegseth exposed real fractures inside the security establishment.</w:t>
       </w:r>
     </w:p>
     <w:p>
@@ -43,7 +43,7 @@
         <w:t xml:space="preserve">1. </w:t>
       </w:r>
       <w:r>
-        <w:t>Trump signed an executive order renaming Lake Ontario to Lake America and posted AI-generated propaganda videos mocking the change. The president used unilateral executive authority to alter official U.S. geographic naming records and pressured private map companies, escalating a trade dispute with Canada while erasing Indigenous naming history. (The Guardian; Meidas Plus; Popular Information (Judd Legum) | 29 Aug 2026; 31 Aug 2026; 4 Sep 2026)</w:t>
+        <w:t>Trump signed an executive order renaming Lake Ontario to Lake America. The president used executive authority to unilaterally rename a shared international lake, erasing Indigenous naming history and escalating a trade dispute with Canada. (The Guardian | 29 Aug 2026)</w:t>
       </w:r>
     </w:p>
     <w:p>
@@ -54,7 +54,7 @@
         <w:t xml:space="preserve">2. </w:t>
       </w:r>
       <w:r>
-        <w:t>Trump declared Canada "the worst" and threatened further economic retaliation. The president publicly denounced a close democratic ally amid a trade dispute, using inflammatory rhetoric rather than diplomatic negotiation to manage international relations. (The Guardian | 31 Aug 2026)</w:t>
+        <w:t>Trump reached out to Apple to change Apple Maps to reflect the Lake America renaming. The president personally pressured a private company to alter public geographic information systems to match his executive order, extending state power over private platforms. (Meidas Plus | 31 Aug 2026)</w:t>
       </w:r>
     </w:p>
     <w:p>
@@ -65,7 +65,7 @@
         <w:t xml:space="preserve">3. </w:t>
       </w:r>
       <w:r>
-        <w:t>Trump ordered airstrikes on Iranian targets near the Strait of Hormuz and threatened larger strikes. Direct presidential military action against a foreign nation, including threats of escalation and possible mass civilian harm, raised war-powers and accountability concerns absent clear congressional authorization. (Meidas Plus | 1 Sep 2026)</w:t>
+        <w:t>Google changed Lake Ontario's name to Lake America on its maps app. A major technology platform altered official geographic naming to comply with presidential preference, raising concerns about corporate deference to executive power over public information. (Meidas Plus | 29 Aug 2026)</w:t>
       </w:r>
     </w:p>
     <w:p>
@@ -76,7 +76,7 @@
         <w:t xml:space="preserve">4. </w:t>
       </w:r>
       <w:r>
-        <w:t>Trump held an Oval Office press gaggle and stated he would use nuclear weapons if needed against Iran. The president's remarks on nuclear weapons use and hostile treatment of a reporter raised concerns about presidential temperament and decision-making authority over the most extreme military options. (Meidas Plus | 31 Aug 2026)</w:t>
+        <w:t>Apple Maps renamed Lake Ontario per Trump's executive order. A second major platform complied with the presidential renaming directive, reinforcing executive reach into privately controlled information systems. (Popular Information (Judd Legum) | 4 Sep 2026)</w:t>
       </w:r>
     </w:p>
     <w:p>
@@ -87,7 +87,7 @@
         <w:t xml:space="preserve">5. </w:t>
       </w:r>
       <w:r>
-        <w:t>Trump administration negotiated an oil development deal giving the U.S. majority control of Venezuela's oil reserves through a private operator with a history of money-laundering investigations. A Pentagon office brokered resource control over a foreign nation's oil reserves via an opaque private partnership, prompting criticism from a former ambassador and conservative media as imperialism and crony statism. (Meidas Plus; Letters from an American (Heather Cox Richardson); whitehouse | 29 Aug 2026; 30 Aug 2026; 31 Aug 2026; 2 Sep 2026)</w:t>
+        <w:t>Trump declared Canada "the worst" and threatened further economic retaliation. The president publicly denounced a close ally and threatened trade punishment, showing contempt for diplomatic norms in favor of political messaging. (The Guardian | 31 Aug 2026)</w:t>
       </w:r>
     </w:p>
     <w:p>
@@ -98,7 +98,7 @@
         <w:t xml:space="preserve">6. </w:t>
       </w:r>
       <w:r>
-        <w:t>Trump administration attempted to implement USPS mail-ballot restrictions requiring gatekeeper checks against a federal citizenship list. The executive branch sought to impose federal control over state-run election administration through the Postal Service, prompting judicial concern about disenfranchisement and separation-of-powers violations. (Letters from an American (Heather Cox Richardson) | 3 Sep 2026)</w:t>
+        <w:t>Trump posted AI-generated videos mocking Canada and depicting armed geese defending Lake America. The president used fabricated AI imagery to mock a neighboring democracy amid a trade dispute, weaponizing information tools against diplomatic norms. (The Guardian | 31 Aug 2026)</w:t>
       </w:r>
     </w:p>
     <w:p>
@@ -109,7 +109,7 @@
         <w:t xml:space="preserve">7. </w:t>
       </w:r>
       <w:r>
-        <w:t>Solicitor General John Sauer petitioned the Supreme Court to enforce the blocked USPS mail-ballot restrictions. The administration escalated to the Supreme Court to override a district court's constitutional concerns, testing judicial willingness to permit federal control of state election processes weeks before midterms. (Letters from an American (Heather Cox Richardson); The 50501 Movement | 3 Sep 2026; 4 Sep 2026)</w:t>
+        <w:t>Trump held a press gaggle and made statements on nuclear weapons, Venezuela, and the economy. The president publicly did not rule out using nuclear weapons against Iran while attacking a reporter, raising alarm about executive control over the gravest use of force. (Meidas Plus | 31 Aug 2026)</w:t>
       </w:r>
     </w:p>
     <w:p>
@@ -120,7 +120,7 @@
         <w:t xml:space="preserve">8. </w:t>
       </w:r>
       <w:r>
-        <w:t>Interior Secretary Doug Burgum began construction of a 250-foot Trump triumphal arch without required congressional authorization. The administration proceeded with a major federal monument project in violation of the 1986 Commemorative Works Act, asserting executive authority over a statutory requirement for congressional approval. (Letters from an American (Heather Cox Richardson) | 3 Sep 2026)</w:t>
+        <w:t>Trump administration negotiated an oil development deal with Venezuela through the Pentagon. The administration struck a resource deal with Venezuela via a military office rather than diplomatic channels, prioritizing extraction over democratic governance and raising conflict-of-interest concerns. (Meidas Plus; Letters from an American (Heather Cox Richardson) | 29 Aug 2026; 30 Aug 2026)</w:t>
       </w:r>
     </w:p>
     <w:p>
@@ -131,7 +131,7 @@
         <w:t xml:space="preserve">9. </w:t>
       </w:r>
       <w:r>
-        <w:t>U.S. Mint began selling dollar coins bearing Trump's likeness at marked-up prices. Federal minting of coins bearing the sitting president's image, sold well above face value, reflects a use of government institutions for personal glorification. (Letters from an American (Heather Cox Richardson) | 2 Sep 2026)</w:t>
+        <w:t>Interior Secretary Doug Burgum began construction of a triumphal arch without required congressional authorization. The administration proceeded with a major federal monument project in violation of a 1986 law requiring congressional approval, asserting executive power over statutory limits. (Letters from an American (Heather Cox Richardson) | 3 Sep 2026)</w:t>
       </w:r>
     </w:p>
     <w:p>
@@ -142,7 +142,7 @@
         <w:t xml:space="preserve">10. </w:t>
       </w:r>
       <w:r>
-        <w:t>Steve Bannon announced that ICE agents would surround polling places in November. A close Trump ally publicly previewed armed federal law-enforcement presence at polling sites, a practice prohibited under federal law, raising direct concerns about voter intimidation. (Letters from an American (Heather Cox Richardson) | 3 Sep 2026)</w:t>
+        <w:t>Tom Schultz reorganized Forest Service structure, moving headquarters and eliminating regional oversight offices. A former timber lobbyist restructured a federal agency to weaken oversight capacity and shift authority to states, reducing checks on environmental decision-making. (The Guardian | 1 Sep 2026)</w:t>
       </w:r>
     </w:p>
     <w:p>
@@ -153,7 +153,7 @@
         <w:t xml:space="preserve">11. </w:t>
       </w:r>
       <w:r>
-        <w:t>Homeland Security Secretary Markwayne Mullin declined to rule out deploying ICE agents to polling places. A cabinet secretary's refusal to categorically exclude armed immigration agents at polling locations threatens compliance with federal law barring armed personnel at election sites. (The Guardian; Letters from an American (Heather Cox Richardson) | 1 Sep 2026; 2 Sep 2026)</w:t>
+        <w:t>Trump administration announced plan to rescind the Roadless Area Conservation Rule. The administration moved to eliminate 25-year-old protections for 45 million acres of forest, benefiting industries tied to the agency's own leadership. (The Guardian | 1 Sep 2026)</w:t>
       </w:r>
     </w:p>
     <w:p>
@@ -164,7 +164,7 @@
         <w:t xml:space="preserve">12. </w:t>
       </w:r>
       <w:r>
-        <w:t>Trump privately discussed declaring the Iran war over without achieving stated objectives. Reported private deliberations over unilaterally declaring an active conflict concluded, regardless of military outcome, would represent an extraordinary and potentially misleading exercise of executive authority. (Meidas Plus | 3 Sep 2026)</w:t>
+        <w:t>Trump ordered airstrikes on Iranian targets near the Strait of Hormuz and threatened harsher retaliation. The president ordered new strikes on Iran with threats of escalated force, raising war-powers questions and reports of civilian casualties. (Meidas Plus | 1 Sep 2026)</w:t>
       </w:r>
     </w:p>
     <w:p>
@@ -175,26 +175,26 @@
         <w:t xml:space="preserve">13. </w:t>
       </w:r>
       <w:r>
-        <w:t>Trump administration deliberately suppressed public information about the Iran conflict ahead of midterm elections. Aides reportedly sought to keep an active war quiet to avoid voter backlash before elections, subordinating public disclosure of military conflict to partisan electoral timing. (Letters from an American (Heather Cox Richardson) | 2 Sep 2026)</w:t>
+        <w:t>Trump privately discussed declaring the Iran war over. Reports indicate the president is considering a unilateral declaration ending an active conflict, raising questions about the actual military status and use of executive messaging power. (Meidas Plus | 3 Sep 2026)</w:t>
       </w:r>
     </w:p>
     <w:p>
       <w:pPr>
-        <w:pStyle w:val="Heading2"/>
-      </w:pPr>
-      <w:r>
-        <w:t>Institutions and Governance</w:t>
+        <w:ind w:left="504" w:hanging="288"/>
+      </w:pPr>
+      <w:r>
+        <w:t xml:space="preserve">14. </w:t>
+      </w:r>
+      <w:r>
+        <w:t>Trump administration considered escalating the Iran conflict after the midterm elections. Aides reportedly sought to suppress conflict news before midterms while planning intensified action afterward, subordinating war policy to electoral timing. (Letters from an American (Heather Cox Richardson) | 2 Sep 2026)</w:t>
       </w:r>
     </w:p>
     <w:p>
       <w:pPr>
-        <w:ind w:left="504" w:hanging="288"/>
-      </w:pPr>
-      <w:r>
-        <w:t xml:space="preserve">1. </w:t>
-      </w:r>
-      <w:r>
-        <w:t>US Supreme Court ruled 5-4 to permit continued construction of the White House ballroom by finding the challenger lacked standing. The Court allowed executive construction on federal property to proceed without resolving whether Congress had authorized it, narrowing standing for institutional challengers and drawing a sharp dissent from the Chief Justice. (The Guardian; Letters from an American (Heather Cox Richardson); Just Security; scotusopinions | 31 Aug 2026)</w:t>
+        <w:pStyle w:val="Heading2"/>
+      </w:pPr>
+      <w:r>
+        <w:t>Institutions and Governance</w:t>
       </w:r>
     </w:p>
     <w:p>
@@ -202,10 +202,10 @@
         <w:ind w:left="504" w:hanging="288"/>
       </w:pPr>
       <w:r>
-        <w:t xml:space="preserve">2. </w:t>
-      </w:r>
-      <w:r>
-        <w:t>U.S. District Judge Indira Talwani temporarily blocked and later extended the block on the Trump administration's USPS mail-ballot verification rule. A federal court found the government's new ballot-verification rule likely unlawful and unconstitutional, protecting mail voters from a system a whistleblower warned could disenfranchise millions. (The 50501 Movement; Just Security; Meidas Plus; Letters from an American (Heather Cox Richardson) | 31 Aug 2026; 1 Sep 2026; 3 Sep 2026)</w:t>
+        <w:t xml:space="preserve">1. </w:t>
+      </w:r>
+      <w:r>
+        <w:t>House Oversight Committee held a shadow hearing examining Trump administration affordability claims. Congressional Democrats documented a gap between campaign promises and economic outcomes, using oversight tools to build a public record ahead of midterms. (Meidas Plus | 29 Aug 2026)</w:t>
       </w:r>
     </w:p>
     <w:p>
@@ -213,10 +213,10 @@
         <w:ind w:left="504" w:hanging="288"/>
       </w:pPr>
       <w:r>
-        <w:t xml:space="preserve">3. </w:t>
-      </w:r>
-      <w:r>
-        <w:t>Judge Deborah Boardman issued a temporary injunction blocking Trump's second executive order restricting birthright citizenship. A federal judge enforced Supreme Court precedent against a renewed executive attempt to deny automatic citizenship to certain U.S.-born children, upholding judicial supremacy over executive overreach. (The Guardian | 3 Sep 2026)</w:t>
+        <w:t xml:space="preserve">2. </w:t>
+      </w:r>
+      <w:r>
+        <w:t>Rep. James Clyburn endorsed expanding the Supreme Court to 13 justices. A senior Democratic lawmaker publicly backed court expansion, signaling potential legislative efforts to alter judicial branch composition. (Meidas Plus | 29 Aug 2026)</w:t>
       </w:r>
     </w:p>
     <w:p>
@@ -224,10 +224,10 @@
         <w:ind w:left="504" w:hanging="288"/>
       </w:pPr>
       <w:r>
-        <w:t xml:space="preserve">4. </w:t>
-      </w:r>
-      <w:r>
-        <w:t>Judge Cynthia Valenzuela dismissed the Trump DOJ's lawsuit challenging California's trans-inclusive school sports policy. A federal court rejected the administration's attempt to use funding leverage to override a state's LGBTQ-inclusive policy, affirming limits on executive coercion of state governance. (The Guardian | 2 Sep 2026)</w:t>
+        <w:t xml:space="preserve">3. </w:t>
+      </w:r>
+      <w:r>
+        <w:t>James Clyburn expressed regret over his 1991 support for Clarence Thomas's Supreme Court confirmation. A senior lawmaker publicly disavowed a past judicial confirmation vote, reflecting ongoing debate over the ideological direction and legitimacy of the Court. (The Guardian | 31 Aug 2026)</w:t>
       </w:r>
     </w:p>
     <w:p>
@@ -235,10 +235,10 @@
         <w:ind w:left="504" w:hanging="288"/>
       </w:pPr>
       <w:r>
-        <w:t xml:space="preserve">5. </w:t>
-      </w:r>
-      <w:r>
-        <w:t>House of Representatives passed a continuing resolution funding the government through December 11. Congress fulfilled its core funding function ahead of midterms, avoiding a shutdown, though two Democrats broke ranks with leadership on a related procedural rule. (The Guardian; Congress.gov | 1 Sep 2026; 2 Sep 2026)</w:t>
+        <w:t xml:space="preserve">4. </w:t>
+      </w:r>
+      <w:r>
+        <w:t>US Supreme Court ruled 5-4 to permit continued construction of the White House ballroom, finding challengers lacked standing. The Court allowed executive construction on federal property to proceed without resolving whether Congress authorized it, with Chief Justice Roberts dissenting on separation-of-powers grounds. (The Guardian; Letters from an American (Heather Cox Richardson); Just Security; Supreme Court of the United States (Opinions) | 31 Aug 2026)</w:t>
       </w:r>
     </w:p>
     <w:p>
@@ -246,10 +246,10 @@
         <w:ind w:left="504" w:hanging="288"/>
       </w:pPr>
       <w:r>
-        <w:t xml:space="preserve">6. </w:t>
-      </w:r>
-      <w:r>
-        <w:t>Hakeem Jeffries referred two Democratic representatives to the caucus rules committee for voting with Republicans on a procedural rule. Internal party discipline proceedings over a procedural defection illustrate fragility in legislative coalitions and questions about the scope of leadership authority to punish dissenting members. (The Guardian | 2 Sep 2026)</w:t>
+        <w:t xml:space="preserve">5. </w:t>
+      </w:r>
+      <w:r>
+        <w:t>Judge Indira Talwani temporarily blocked a Trump administration mail-ballot verification rule. A federal judge halted a new postal rule likely to disenfranchise mail voters, finding the government had not shown evidence of fraud justifying the restrictions. (The 50501 Movement; Just Security | 31 Aug 2026)</w:t>
       </w:r>
     </w:p>
     <w:p>
@@ -257,10 +257,10 @@
         <w:ind w:left="504" w:hanging="288"/>
       </w:pPr>
       <w:r>
-        <w:t xml:space="preserve">7. </w:t>
-      </w:r>
-      <w:r>
-        <w:t>Speaker Mike Johnson canceled House votes for the final two weeks of September before the midterms. The Speaker's cancellation of legislative business curtailed congressional oversight and public accountability on major policy issues in the run-up to elections. (Letters from an American (Heather Cox Richardson) | 3 Sep 2026)</w:t>
+        <w:t xml:space="preserve">6. </w:t>
+      </w:r>
+      <w:r>
+        <w:t>Brenda Sannes struck down New York's climate superfund law requiring oil companies to pay damages. A federal judge invalidated a state climate accountability law backed by the Trump Justice Department, weakening state capacity to address climate harms. (The Guardian; U.S. Department of Justice | 31 Aug 2026)</w:t>
       </w:r>
     </w:p>
     <w:p>
@@ -268,10 +268,10 @@
         <w:ind w:left="504" w:hanging="288"/>
       </w:pPr>
       <w:r>
-        <w:t xml:space="preserve">8. </w:t>
-      </w:r>
-      <w:r>
-        <w:t>House Oversight Committee subpoenaed and sought contempt proceedings against billionaire Leon Black over Epstein-related nondisclosure agreements. A witness's defiance of congressional subpoenas and lawsuit challenging committee authority tested Congress's investigative power over evidence related to sex trafficking. (The Guardian; Meidas Plus | 2 Sep 2026; 3 Sep 2026; 4 Sep 2026)</w:t>
+        <w:t xml:space="preserve">7. </w:t>
+      </w:r>
+      <w:r>
+        <w:t>Senator Richard Blumenthal demanded USPS cease its ballot mail project and disclose related records. A senator invoked oversight authority to challenge an alleged election-sabotage scheme, asserting legislative check on executive election administration. (Letters from an American (Heather Cox Richardson); Meidas Plus | 31 Aug 2026; 1 Sep 2026)</w:t>
       </w:r>
     </w:p>
     <w:p>
@@ -279,10 +279,10 @@
         <w:ind w:left="504" w:hanging="288"/>
       </w:pPr>
       <w:r>
-        <w:t xml:space="preserve">9. </w:t>
-      </w:r>
-      <w:r>
-        <w:t>Representatives Ro Khanna and Thomas Massie filed a discharge petition to force a House vote on the Epstein Files Transparency Act 2.0. A bipartisan effort to bypass the Speaker sought to compel disclosure of Epstein-related files after DOJ stonewalling, testing congressional independence from executive obstruction. (Letters from an American (Heather Cox Richardson) | 3 Sep 2026)</w:t>
+        <w:t xml:space="preserve">8. </w:t>
+      </w:r>
+      <w:r>
+        <w:t>Hakeem Jeffries held a press conference opposing Republican data center legislation. Democratic leadership criticized legislation preempting state regulation of data centers, highlighting partisan conflict over corporate versus local authority. (Meidas Plus | 31 Aug 2026)</w:t>
       </w:r>
     </w:p>
     <w:p>
@@ -290,10 +290,10 @@
         <w:ind w:left="504" w:hanging="288"/>
       </w:pPr>
       <w:r>
-        <w:t xml:space="preserve">10. </w:t>
-      </w:r>
-      <w:r>
-        <w:t>House Republicans opened an investigation into several labor unions' political spending based on claims from conservative nonprofits. A congressional inquiry targeting unions' lawful political advocacy ahead of midterms raises concerns about using government scrutiny to chill labor organizing and Democratic-aligned speech. (The Guardian | 1 Sep 2026)</w:t>
+        <w:t xml:space="preserve">9. </w:t>
+      </w:r>
+      <w:r>
+        <w:t>Avery A. Trainor filed a constitutional complaint challenging the transgender military service ban and a related demotion. A transgender officer sued over equal protection and due process violations tied to executive military policy, testing the limits of executive authority over personnel. (Just Security | 31 Aug 2026)</w:t>
       </w:r>
     </w:p>
     <w:p>
@@ -301,10 +301,10 @@
         <w:ind w:left="504" w:hanging="288"/>
       </w:pPr>
       <w:r>
-        <w:t xml:space="preserve">11. </w:t>
-      </w:r>
-      <w:r>
-        <w:t>US House of Representatives passed a bill penalizing universities that participate in boycotts of Israel. The House conditioned federal student aid on university compliance with a specific political stance, raising First Amendment and academic-freedom concerns. (The Guardian | 3 Sep 2026)</w:t>
+        <w:t xml:space="preserve">10. </w:t>
+      </w:r>
+      <w:r>
+        <w:t>Electronic Privacy Information Center filed a complaint challenging an executive order compiling state citizenship voter lists. A privacy rights group sued over an executive order directing creation of citizenship databases shared with states, alleging privacy and separation-of-powers violations. (Just Security | 31 Aug 2026)</w:t>
       </w:r>
     </w:p>
     <w:p>
@@ -312,10 +312,10 @@
         <w:ind w:left="504" w:hanging="288"/>
       </w:pPr>
       <w:r>
-        <w:t xml:space="preserve">12. </w:t>
-      </w:r>
-      <w:r>
-        <w:t>Democratic representatives Kennedy, Morelle, and Dingell introduced legislation to block Trump's Lake Ontario renaming and future unilateral geographic renamings. Congressional pushback against executive overreach sought to reassert legislative authority over federal geographic designations affecting an international body of water. (The Guardian | 1 Sep 2026)</w:t>
+        <w:t xml:space="preserve">11. </w:t>
+      </w:r>
+      <w:r>
+        <w:t>Democratic representatives Kennedy, Morelle, and Dingell introduced legislation to block the Lake Ontario renaming. Lawmakers moved to constrain a unilateral presidential renaming order, asserting congressional authority over federal geographic designations. (The Guardian | 1 Sep 2026)</w:t>
       </w:r>
     </w:p>
     <w:p>
@@ -323,10 +323,10 @@
         <w:ind w:left="504" w:hanging="288"/>
       </w:pPr>
       <w:r>
-        <w:t xml:space="preserve">13. </w:t>
-      </w:r>
-      <w:r>
-        <w:t>Rep. James Clyburn endorsed expanding the Supreme Court to 13 justices and expressed regret over supporting Clarence Thomas's confirmation. A senior Democratic lawmaker publicly called for altering the Court's composition, reflecting concern over the judiciary's ideological direction and signaling potential legislative action. (Meidas Plus; The Guardian | 29 Aug 2026; 31 Aug 2026)</w:t>
+        <w:t xml:space="preserve">12. </w:t>
+      </w:r>
+      <w:r>
+        <w:t>House of Representatives passed a continuing resolution funding the government through December 11. Congress avoided a shutdown before midterms, though the bill delayed scrutiny of a budget rule Democrats feared would allow arbitrary grant cancellations. (The Guardian | 1 Sep 2026)</w:t>
       </w:r>
     </w:p>
     <w:p>
@@ -334,10 +334,10 @@
         <w:ind w:left="504" w:hanging="288"/>
       </w:pPr>
       <w:r>
-        <w:t xml:space="preserve">14. </w:t>
-      </w:r>
-      <w:r>
-        <w:t>Federal judge Paul Engelmayer rejected Ghislaine Maxwell's constitutional challenge to her conviction. A federal court closed a major legal avenue for overturning Maxwell's conviction, shifting focus to whether executive clemency might be used to circumvent the judicial process. (The Guardian | 30 Aug 2026)</w:t>
+        <w:t xml:space="preserve">13. </w:t>
+      </w:r>
+      <w:r>
+        <w:t>Jared Golden and Marie Gluesenkamp Perez voted with Republicans on a procedural rule, prompting a leadership referral for discipline. Two Democrats broke ranks on a procedural vote, exposing fractures within the party's legislative coalition during divided government. (The Guardian | 1 Sep 2026; 2 Sep 2026)</w:t>
       </w:r>
     </w:p>
     <w:p>
@@ -345,10 +345,10 @@
         <w:ind w:left="504" w:hanging="288"/>
       </w:pPr>
       <w:r>
-        <w:t xml:space="preserve">15. </w:t>
-      </w:r>
-      <w:r>
-        <w:t>Congress enacted a continuing appropriations act for fiscal year 2027. Passage of continuing appropriations sustained federal operations, reflecting Congress fulfilling its constitutional duty to fund government activities. (Congress.gov | 2 Sep 2026)</w:t>
+        <w:t xml:space="preserve">14. </w:t>
+      </w:r>
+      <w:r>
+        <w:t>House Republicans opened an investigation into labor unions' political spending. Republicans launched a probe into unions' lawful political activity based on claims from conservative advocacy groups, raising concerns about targeting protected speech ahead of midterms. (The Guardian | 1 Sep 2026)</w:t>
       </w:r>
     </w:p>
     <w:p>
@@ -356,10 +356,10 @@
         <w:ind w:left="504" w:hanging="288"/>
       </w:pPr>
       <w:r>
-        <w:t xml:space="preserve">16. </w:t>
-      </w:r>
-      <w:r>
-        <w:t>Various federal courts issued rulings and procedural orders in ongoing litigation challenging Trump administration actions. Multiple court filings and rulings adjusted the legal posture of pending challenges to federal policy, part of ongoing judicial checks on executive action across several dockets. (Just Security; justice | 29 Aug 2026; 31 Aug 2026; 2 Sep 2026; 3 Sep 2026)</w:t>
+        <w:t xml:space="preserve">15. </w:t>
+      </w:r>
+      <w:r>
+        <w:t>Multiple House Democrats called for the impeachment of Defense Secretary Pete Hegseth. Several lawmakers cited corruption, mistreatment of troops, and an unauthorized war as grounds to remove a cabinet official, escalating institutional conflict over military leadership. (Meidas Plus | 1 Sep 2026)</w:t>
       </w:r>
     </w:p>
     <w:p>
@@ -367,10 +367,10 @@
         <w:ind w:left="504" w:hanging="288"/>
       </w:pPr>
       <w:r>
-        <w:t xml:space="preserve">17. </w:t>
-      </w:r>
-      <w:r>
-        <w:t>Electronic Privacy Information Center filed a complaint challenging an executive order directing creation of state citizenship lists for voter-roll use. A privacy rights group sued to block a federal program consolidating sensitive citizenship data for distribution to state election officials, alleging violations of privacy law and separation of powers. (Just Security | 31 Aug 2026)</w:t>
+        <w:t xml:space="preserve">16. </w:t>
+      </w:r>
+      <w:r>
+        <w:t>Judge Tony Graf ruled that Tyler Robinson must stand trial for aggravated murder, making him eligible for the death penalty. A Utah court set the legal framework for a capital trial in the killing of a prominent political figure, a high-profile test of judicial process. (The Guardian | 1 Sep 2026)</w:t>
       </w:r>
     </w:p>
     <w:p>
@@ -378,10 +378,10 @@
         <w:ind w:left="504" w:hanging="288"/>
       </w:pPr>
       <w:r>
-        <w:t xml:space="preserve">18. </w:t>
-      </w:r>
-      <w:r>
-        <w:t>Patagonia and conservation groups filed a federal lawsuit challenging Trump's reductions of Bears Ears and Grand Staircase-Escalante national monuments. Conservation groups tested statutory and constitutional limits on presidential authority to dismantle protected public lands under the Antiquities Act. (The Guardian | 2 Sep 2026)</w:t>
+        <w:t xml:space="preserve">17. </w:t>
+      </w:r>
+      <w:r>
+        <w:t>Slavin, Korte, Lederer sued the Pentagon alleging First Amendment retaliation for press-freedom advocacy. Fired military journalists sued over alleged censorship, testing constitutional limits on Pentagon control of military media. (Letters from an American (Heather Cox Richardson) | 1 Sep 2026)</w:t>
       </w:r>
     </w:p>
     <w:p>
@@ -389,10 +389,10 @@
         <w:ind w:left="504" w:hanging="288"/>
       </w:pPr>
       <w:r>
-        <w:t xml:space="preserve">19. </w:t>
-      </w:r>
-      <w:r>
-        <w:t>Avery A. Trainor filed a federal complaint challenging the transgender military service ban and a related demotion. A transgender military officer's lawsuit raises equal protection and due process questions about executive authority over military personnel policy. (Just Security | 31 Aug 2026)</w:t>
+        <w:t xml:space="preserve">18. </w:t>
+      </w:r>
+      <w:r>
+        <w:t>Federal court blocked the USPS mail-voting verification rule pending further review. A court halted an executive rule affecting mail ballots ahead of a Supreme Court test of its legality before the midterms. (Meidas Plus | 1 Sep 2026)</w:t>
       </w:r>
     </w:p>
     <w:p>
@@ -400,10 +400,10 @@
         <w:ind w:left="504" w:hanging="288"/>
       </w:pPr>
       <w:r>
-        <w:t xml:space="preserve">20. </w:t>
-      </w:r>
-      <w:r>
-        <w:t>Massachusetts, South Carolina electorates held primary elections including a Senate race testing generational leadership and a new race after Lindsey Graham's death. State primaries determined candidates for federal Senate seats, reflecting core democratic processes shaping representation ahead of the midterms. (The 50501 Movement; The Guardian; justice | 31 Aug 2026; 1 Sep 2026)</w:t>
+        <w:t xml:space="preserve">19. </w:t>
+      </w:r>
+      <w:r>
+        <w:t>Congress enacted continuing appropriations for fiscal year 2027. Congress passed a law sustaining federal funding, fulfilling its basic constitutional duty and averting a shutdown. (Congress.gov | 2 Sep 2026)</w:t>
       </w:r>
     </w:p>
     <w:p>
@@ -411,10 +411,10 @@
         <w:ind w:left="504" w:hanging="288"/>
       </w:pPr>
       <w:r>
-        <w:t xml:space="preserve">21. </w:t>
-      </w:r>
-      <w:r>
-        <w:t>Justice Department Office of Legal Counsel issued an opinion authorizing DHS to share statewide voter lists with immigration enforcement for cross-checking against federal databases. A DOJ legal opinion legitimized sharing voter registration data with immigration agencies, raising privacy and due process concerns about the scope of executive authority over elections. (The 50501 Movement | 2 Sep 2026)</w:t>
+        <w:t xml:space="preserve">20. </w:t>
+      </w:r>
+      <w:r>
+        <w:t>House oversight committee issued subpoenas compelling billionaire Leon Black to testify on Epstein ties. Congress sought testimony and records from a witness accused of delaying an investigation into a major sex-trafficking case, testing subpoena enforcement power. (The Guardian | 2 Sep 2026)</w:t>
       </w:r>
     </w:p>
     <w:p>
@@ -422,10 +422,10 @@
         <w:ind w:left="504" w:hanging="288"/>
       </w:pPr>
       <w:r>
-        <w:t xml:space="preserve">22. </w:t>
-      </w:r>
-      <w:r>
-        <w:t>DOJ issued a legal opinion expanding state reporting requirements for undocumented immigrants across all state agencies receiving TANF or SSI funds. A reversal of a 30-year-old policy dramatically broadened federal immigration surveillance into unrelated state institutions, chilling access to public services for immigrant communities. (The Guardian; The 50501 Movement; justice | 2 Sep 2026; 3 Sep 2026)</w:t>
+        <w:t xml:space="preserve">21. </w:t>
+      </w:r>
+      <w:r>
+        <w:t>Judge Cynthia Valenzuela dismissed the Trump DOJ's lawsuit challenging California's trans-inclusive school sports policy. A federal court rejected an attempt to use funding leverage to override a state's LGBTQ-inclusive policy, limiting executive overreach into state authority. (The Guardian | 2 Sep 2026)</w:t>
       </w:r>
     </w:p>
     <w:p>
@@ -433,10 +433,10 @@
         <w:ind w:left="504" w:hanging="288"/>
       </w:pPr>
       <w:r>
-        <w:t xml:space="preserve">23. </w:t>
-      </w:r>
-      <w:r>
-        <w:t>House oversight ranking Democrats called for the impeachment of Defense Secretary Pete Hegseth. Multiple House Democrats publicly called for impeachment of a Cabinet secretary over alleged corruption, mistreatment of troops, and unauthorized war conduct, escalating institutional conflict over military leadership. (Meidas Plus | 1 Sep 2026)</w:t>
+        <w:t xml:space="preserve">22. </w:t>
+      </w:r>
+      <w:r>
+        <w:t>Patagonia and conservation groups filed a federal lawsuit challenging Trump's reductions of Bears Ears and Grand Staircase-Escalante monuments. Conservation groups sued to test statutory and constitutional limits on presidential power to shrink protected public lands. (The Guardian | 2 Sep 2026)</w:t>
       </w:r>
     </w:p>
     <w:p>
@@ -444,18 +444,21 @@
         <w:ind w:left="504" w:hanging="288"/>
       </w:pPr>
       <w:r>
-        <w:t xml:space="preserve">24. </w:t>
-      </w:r>
-      <w:r>
-        <w:t>Senator Richard Blumenthal demanded USPS cease the ballot-mail IT project and disclose all related records. Congressional oversight authority was invoked to force transparency and cessation of an alleged election-sabotage IT scheme within the Postal Service. (Letters from an American (Heather Cox Richardson); Meidas Plus | 31 Aug 2026; 1 Sep 2026)</w:t>
+        <w:t xml:space="preserve">23. </w:t>
+      </w:r>
+      <w:r>
+        <w:t>State of Illinois filed a complaint against the Department of Health and Human Services. A state initiated litigation testing the legality of a federal agency action, part of ongoing checks on executive authority. (Just Security | 2 Sep 2026)</w:t>
       </w:r>
     </w:p>
     <w:p>
       <w:pPr>
-        <w:pStyle w:val="Heading2"/>
-      </w:pPr>
-      <w:r>
-        <w:t>Civil Rights and Dissent</w:t>
+        <w:ind w:left="504" w:hanging="288"/>
+      </w:pPr>
+      <w:r>
+        <w:t xml:space="preserve">24. </w:t>
+      </w:r>
+      <w:r>
+        <w:t>Leon Black failed to appear for a House oversight deposition and sued to challenge the committee's subpoena authority. A witness's defiance of a congressional subpoena and legal challenge to committee power directly tested Congress's investigative authority. (The Guardian; Meidas Plus | 3 Sep 2026; 4 Sep 2026)</w:t>
       </w:r>
     </w:p>
     <w:p>
@@ -463,10 +466,10 @@
         <w:ind w:left="504" w:hanging="288"/>
       </w:pPr>
       <w:r>
-        <w:t xml:space="preserve">1. </w:t>
-      </w:r>
-      <w:r>
-        <w:t>DHS used an obscure customs statute to obtain phone, financial, and social media records on journalists, unions, and nonprofits without judicial oversight. DHS circumvented Fourth Amendment protections to surveil journalists, labor unions, and advocacy groups using administrative summonses that bypassed judicial review previously denied for lack of probable cause. (The Guardian; Meidas Plus | 29 Aug 2026)</w:t>
+        <w:t xml:space="preserve">25. </w:t>
+      </w:r>
+      <w:r>
+        <w:t>US House of Representatives passed a bill penalizing universities that participate in boycotts of Israel. The House conditioned federal student aid on institutional compliance with a specific political position, raising First Amendment and academic freedom concerns. (The Guardian | 3 Sep 2026)</w:t>
       </w:r>
     </w:p>
     <w:p>
@@ -474,10 +477,10 @@
         <w:ind w:left="504" w:hanging="288"/>
       </w:pPr>
       <w:r>
-        <w:t xml:space="preserve">2. </w:t>
-      </w:r>
-      <w:r>
-        <w:t>Senators Ron Wyden and Pramila Jayapal requested a GAO investigation into DHS's use of administrative summonses for warrantless surveillance. Congressional Democrats sought accountability for systematic surveillance of journalists and activists that bypassed judicial oversight, targeting a threat to First Amendment protections. (The Guardian | 2 Sep 2026)</w:t>
+        <w:t xml:space="preserve">26. </w:t>
+      </w:r>
+      <w:r>
+        <w:t>Representatives Ro Khanna and Thomas Massie filed a discharge petition to force a vote on Epstein Files Transparency Act 2.0. Lawmakers sought to bypass leadership and compel disclosure of Epstein-related files amid alleged DOJ stonewalling, testing congressional independence from executive obstruction. (Letters from an American (Heather Cox Richardson) | 3 Sep 2026)</w:t>
       </w:r>
     </w:p>
     <w:p>
@@ -485,10 +488,10 @@
         <w:ind w:left="504" w:hanging="288"/>
       </w:pPr>
       <w:r>
-        <w:t xml:space="preserve">3. </w:t>
-      </w:r>
-      <w:r>
-        <w:t>ICE arrested and deported far-right commentator Milo Yiannopoulos within 24 hours. The unusually rapid deportation of a politically prominent figure raised questions about whether immigration enforcement speed correlates with political considerations rather than standard procedure. (The Guardian | 29 Aug 2026)</w:t>
+        <w:t xml:space="preserve">27. </w:t>
+      </w:r>
+      <w:r>
+        <w:t>Speaker Mike Johnson canceled House votes for the final two weeks of September. The Speaker halted legislative business ahead of midterms, shielding members from voting on controversial issues and limiting congressional accountability. (Letters from an American (Heather Cox Richardson) | 3 Sep 2026)</w:t>
       </w:r>
     </w:p>
     <w:p>
@@ -496,10 +499,10 @@
         <w:ind w:left="504" w:hanging="288"/>
       </w:pPr>
       <w:r>
-        <w:t xml:space="preserve">4. </w:t>
-      </w:r>
-      <w:r>
-        <w:t>ICE detained a 76-year-old permanent resident with stage 4 cancer over a decades-old undisclosed conviction. Detention of a long-term legal resident with advanced cancer based on retroactive visa disclosure requirements raises due process and proportionality concerns in immigration enforcement. (The Guardian | 1 Sep 2026)</w:t>
+        <w:t xml:space="preserve">28. </w:t>
+      </w:r>
+      <w:r>
+        <w:t>James Comer declined to immediately hold Leon Black in contempt of Congress. A committee chair delayed enforcement action against a defiant witness, raising questions about the strength of congressional oversight tools. (Meidas Plus | 3 Sep 2026)</w:t>
       </w:r>
     </w:p>
     <w:p>
@@ -507,10 +510,10 @@
         <w:ind w:left="504" w:hanging="288"/>
       </w:pPr>
       <w:r>
-        <w:t xml:space="preserve">5. </w:t>
-      </w:r>
-      <w:r>
-        <w:t>DOJ/EOIR mandated training instructing immigration judges to deny or sharply limit continuances for vulnerable respondents. A directive to accelerate deportations by curbing legal delays undermines due process for immigrants awaiting visas, legal counsel, or protections, prioritizing removal speed over judicial fairness. (The Guardian | 4 Sep 2026)</w:t>
+        <w:t xml:space="preserve">29. </w:t>
+      </w:r>
+      <w:r>
+        <w:t>Robert Garcia identified Jared Kushner and Stephen Miller as top investigation targets if Democrats regain the majority. A ranking committee Democrat signaled future oversight priorities contingent on midterm election outcomes. (Meidas Plus | 3 Sep 2026)</w:t>
       </w:r>
     </w:p>
     <w:p>
@@ -518,10 +521,10 @@
         <w:ind w:left="504" w:hanging="288"/>
       </w:pPr>
       <w:r>
-        <w:t xml:space="preserve">6. </w:t>
-      </w:r>
-      <w:r>
-        <w:t>ICE imposed a blanket ban on contact visits at California's largest detention facility. A prohibition on physical contact between detainees and family, more restrictive than rules for convicted felons, drew a state audit finding and a grassroots family campaign for reversal. (The Guardian | 4 Sep 2026)</w:t>
+        <w:t xml:space="preserve">30. </w:t>
+      </w:r>
+      <w:r>
+        <w:t>Robert Garcia announced plans for a future contempt motion against Leon Black. A ranking member pledged to pursue enforcement of subpoena compliance once in the majority, highlighting partisan division over oversight tools. (Meidas Plus | 3 Sep 2026)</w:t>
       </w:r>
     </w:p>
     <w:p>
@@ -529,10 +532,10 @@
         <w:ind w:left="504" w:hanging="288"/>
       </w:pPr>
       <w:r>
-        <w:t xml:space="preserve">7. </w:t>
-      </w:r>
-      <w:r>
-        <w:t>ICE deported a five-year-old child and his father to Mexico without apparent judicial review. Removal of a minor child without due process safeguards demonstrates enforcement practices that bypass legal protections for vulnerable individuals. (Democracy Outloud (Karen Zeigler) | 4 Sep 2026)</w:t>
+        <w:t xml:space="preserve">31. </w:t>
+      </w:r>
+      <w:r>
+        <w:t>Thom Tillis publicly criticized Defense Secretary Hegseth's management and called for his replacement. A Republican senator's public rebuke of a cabinet secretary signals significant intra-party conflict over Pentagon leadership. (Meidas Plus | 3 Sep 2026)</w:t>
       </w:r>
     </w:p>
     <w:p>
@@ -540,10 +543,10 @@
         <w:ind w:left="504" w:hanging="288"/>
       </w:pPr>
       <w:r>
-        <w:t xml:space="preserve">8. </w:t>
-      </w:r>
-      <w:r>
-        <w:t>ICE arrested approximately 50,000 people in July, most without criminal records. Mass immigration arrests disconnected from public-safety rationale raise due-process concerns and indicate enforcement scaled beyond legitimate law-enforcement purposes. (Democracy Outloud (Karen Zeigler) | 4 Sep 2026)</w:t>
+        <w:t xml:space="preserve">32. </w:t>
+      </w:r>
+      <w:r>
+        <w:t>Judge Deborah Boardman issued a temporary injunction blocking Trump's second executive order restricting birthright citizenship. A federal court reaffirmed constitutional birthright citizenship protections against a renewed executive attempt to override a prior Supreme Court ruling. (The Guardian | 3 Sep 2026)</w:t>
       </w:r>
     </w:p>
     <w:p>
@@ -551,10 +554,10 @@
         <w:ind w:left="504" w:hanging="288"/>
       </w:pPr>
       <w:r>
-        <w:t xml:space="preserve">9. </w:t>
-      </w:r>
-      <w:r>
-        <w:t>DHS redirected hundreds of USCIS fraud-investigation officers to examine voter registration data for noncitizens. Federal immigration officers were reassigned to review voter rolls ahead of midterms despite unsubstantiated figures, raising concern that election-integrity claims justify expanded surveillance. (The 50501 Movement | 31 Aug 2026; 2 Sep 2026)</w:t>
+        <w:t xml:space="preserve">33. </w:t>
+      </w:r>
+      <w:r>
+        <w:t>Los Angeles County Judge denied a preliminary injunction against a plan to cull approximately 2,000 non-native deer on Catalina Island. A court permitted a large-scale wildlife removal program to proceed, raising questions about environmental authority and public input. (The Guardian | 3 Sep 2026)</w:t>
       </w:r>
     </w:p>
     <w:p>
@@ -562,10 +565,10 @@
         <w:ind w:left="504" w:hanging="288"/>
       </w:pPr>
       <w:r>
-        <w:t xml:space="preserve">10. </w:t>
-      </w:r>
-      <w:r>
-        <w:t>Homeland Security Investigations launched a coordinated voter-fraud investigation across nine states timed to run through the early-voting period. A federal law-enforcement surge targeting alleged noncitizen voting was scheduled to continue into active voting periods, raising concerns about politicization and voter intimidation. (The 50501 Movement | 2 Sep 2026)</w:t>
+        <w:t xml:space="preserve">34. </w:t>
+      </w:r>
+      <w:r>
+        <w:t>Judge Indira Talwani held a hearing questioning the constitutionality of extending the USPS ballot restrictions. A federal judge expressed skepticism that the administration's mail-ballot rule could withstand constitutional scrutiny, citing risk of major disenfranchisement. (Letters from an American (Heather Cox Richardson) | 3 Sep 2026)</w:t>
       </w:r>
     </w:p>
     <w:p>
@@ -573,10 +576,10 @@
         <w:ind w:left="504" w:hanging="288"/>
       </w:pPr>
       <w:r>
-        <w:t xml:space="preserve">11. </w:t>
-      </w:r>
-      <w:r>
-        <w:t>DHS identified over 250,000 potential noncitizens on voter rolls in four states, with state officials disputing the accuracy. A large discrepancy between initial noncitizen-voter estimates and confirmed cases raised questions about false positives threatening eligible voters' registration status. (The 50501 Movement | 2 Sep 2026)</w:t>
+        <w:t xml:space="preserve">35. </w:t>
+      </w:r>
+      <w:r>
+        <w:t>Solicitor General John Sauer petitioned the Supreme Court to enforce the USPS mail-ballot restrictions. The administration escalated to the Supreme Court to override a district court's constitutional concerns about federal control of state elections. (Letters from an American (Heather Cox Richardson) | 3 Sep 2026)</w:t>
       </w:r>
     </w:p>
     <w:p>
@@ -584,10 +587,10 @@
         <w:ind w:left="504" w:hanging="288"/>
       </w:pPr>
       <w:r>
-        <w:t xml:space="preserve">12. </w:t>
-      </w:r>
-      <w:r>
-        <w:t>ProPublica reported that fewer than 150 alleged noncitizen voters were referred for prosecution despite tens of thousands of leads. Investigative reporting found minimal prosecutions relative to the scale of the government's noncitizen-voter identification effort, alongside internal warnings about false-match risks. (The 50501 Movement | 2 Sep 2026)</w:t>
+        <w:t xml:space="preserve">36. </w:t>
+      </w:r>
+      <w:r>
+        <w:t>Trump administration asked the Supreme Court to revive USPS mail-ballot requirements after a lower court block. The administration continued to press for federal control over mail-ballot procedures despite lower-court findings of likely disenfranchisement. (The 50501 Movement | 4 Sep 2026)</w:t>
       </w:r>
     </w:p>
     <w:p>
@@ -595,10 +598,10 @@
         <w:ind w:left="504" w:hanging="288"/>
       </w:pPr>
       <w:r>
-        <w:t xml:space="preserve">13. </w:t>
-      </w:r>
-      <w:r>
-        <w:t>Tarrant County commissioners voted to eliminate 92 of 316 polling sites ahead of the midterm elections. Reducing polling locations in a major Texas county affecting 1.3 million registered voters directly restricts voting access in a competitive Senate battleground. (Meidas Plus; Letters from an American (Heather Cox Richardson) | 31 Aug 2026; 1 Sep 2026)</w:t>
+        <w:t xml:space="preserve">37. </w:t>
+      </w:r>
+      <w:r>
+        <w:t>Judge William Sullivan declared a mistrial in the Lindsay Clancy murder trial after a deadlocked jury. A high-profile capital case ended without verdict, leaving prosecutorial discretion over retrial and raising questions about mental-health defenses in criminal law. (The Guardian | 4 Sep 2026)</w:t>
       </w:r>
     </w:p>
     <w:p>
@@ -606,10 +609,10 @@
         <w:ind w:left="504" w:hanging="288"/>
       </w:pPr>
       <w:r>
-        <w:t xml:space="preserve">14. </w:t>
-      </w:r>
-      <w:r>
-        <w:t>North Carolina Board of Elections adopted new rules making mail-in voting more difficult, including restricting who may deliver absentee ballots. Newly adopted restrictions on mail-ballot delivery and envelope requirements increase the likelihood that ballots will be rejected for minor infractions, narrowing electoral participation. (Democracy Outloud (Karen Zeigler) | 4 Sep 2026)</w:t>
+        <w:t xml:space="preserve">38. </w:t>
+      </w:r>
+      <w:r>
+        <w:t>SCOTUS issued multiple procedural orders denying stays and injunctions and disbarring four attorneys. The Court's routine docket activity, including attorney discipline and denial of emergency relief in several cases, reflects ordinary judicial administration. (Supreme Court of the United States (Orders) | 4 Sep 2026)</w:t>
       </w:r>
     </w:p>
     <w:p>
@@ -617,10 +620,10 @@
         <w:ind w:left="504" w:hanging="288"/>
       </w:pPr>
       <w:r>
-        <w:t xml:space="preserve">15. </w:t>
-      </w:r>
-      <w:r>
-        <w:t>USPS whistleblower disclosed that a new ballot-handling system could reject entire batches of ballots over single scanning errors. A federal whistleblower warned that rushed, flawed ballot-verification technology risked massive disenfranchisement of mail voters weeks before the midterm elections. (Letters from an American (Heather Cox Richardson); Meidas Plus; Popular Information (Judd Legum) | 1 Sep 2026; 2 Sep 2026; 3 Sep 2026; 4 Sep 2026)</w:t>
+        <w:t xml:space="preserve">39. </w:t>
+      </w:r>
+      <w:r>
+        <w:t>SCOTUS released an opinion in National Park Service v. National Trust for Historic Preservation. The Court's official opinion formalized its earlier ruling permitting White House ballroom construction to proceed pending further litigation. (Supreme Court of the United States (Opinions) | 31 Aug 2026)</w:t>
       </w:r>
     </w:p>
     <w:p>
@@ -628,10 +631,10 @@
         <w:ind w:left="504" w:hanging="288"/>
       </w:pPr>
       <w:r>
-        <w:t xml:space="preserve">16. </w:t>
-      </w:r>
-      <w:r>
-        <w:t>Danbury, Connecticut community members and businesses organized a Day Without an Immigrant protest and march after over 100 ICE arrests. Large-scale coordinated economic action and public march demonstrated organized civil-society resistance to federal immigration enforcement and solidarity with detained residents. (The 50501 Movement | 3 Sep 2026)</w:t>
+        <w:t xml:space="preserve">40. </w:t>
+      </w:r>
+      <w:r>
+        <w:t>SCOTUS released an opinion in National Republican Congressional Committee v. Brown. The Court issued a binding opinion in an election-related case with potential effects on campaign practices and litigants nationwide. (Supreme Court of the United States (Opinions) | 4 Sep 2026)</w:t>
       </w:r>
     </w:p>
     <w:p>
@@ -639,10 +642,10 @@
         <w:ind w:left="504" w:hanging="288"/>
       </w:pPr>
       <w:r>
-        <w:t xml:space="preserve">17. </w:t>
-      </w:r>
-      <w:r>
-        <w:t>Westland, Michigan allowed its license-plate-reader camera contract to expire, joining bipartisan pushback against surveillance technology. Municipal rejection of surveillance infrastructure represents a local democratic check on data collection practices affecting residents' privacy and movement. (The 50501 Movement | 1 Sep 2026)</w:t>
+        <w:t xml:space="preserve">41. </w:t>
+      </w:r>
+      <w:r>
+        <w:t>Justice Department reached a settlement with Ohio State University over undisclosed China ties in federal research funding. A university agreed to pay $2.1 million to resolve claims it concealed foreign government affiliations in applications for federal research money, a routine but consequential integrity enforcement action. (U.S. Department of Justice | 31 Aug 2026)</w:t>
       </w:r>
     </w:p>
     <w:p>
@@ -650,10 +653,10 @@
         <w:ind w:left="504" w:hanging="288"/>
       </w:pPr>
       <w:r>
-        <w:t xml:space="preserve">18. </w:t>
-      </w:r>
-      <w:r>
-        <w:t>Hollywood Police Department shared license plate reader data collected locally with 365 law enforcement agencies nationwide. Nationwide sharing of locally collected surveillance data without explicit local consent creates a de facto national tracking network affecting residents' privacy across state lines. (The 50501 Movement | 3 Sep 2026)</w:t>
+        <w:t xml:space="preserve">42. </w:t>
+      </w:r>
+      <w:r>
+        <w:t>Justice Department reached a consent decree with landlord Pinnacle over algorithmic rent-coordination claims. Federal antitrust enforcers resolved claims that a major landlord used shared data and algorithms to coordinate rents anticompetitively across markets. (U.S. Department of Justice | 4 Sep 2026)</w:t>
       </w:r>
     </w:p>
     <w:p>
@@ -661,10 +664,10 @@
         <w:ind w:left="504" w:hanging="288"/>
       </w:pPr>
       <w:r>
-        <w:t xml:space="preserve">19. </w:t>
-      </w:r>
-      <w:r>
-        <w:t>North Carolina counties and Texas Senate candidate James Talarico opposed deployment of Flock surveillance cameras. Local governments and a federal candidate publicly resisted expansion of mass surveillance technology, reflecting grassroots concern over privacy and government monitoring. (Democracy Outloud (Karen Zeigler) | 4 Sep 2026)</w:t>
+        <w:t xml:space="preserve">43. </w:t>
+      </w:r>
+      <w:r>
+        <w:t>Justice Department reached agreement with Kansas resolving a lawsuit over discrimination against a servicemember. A settlement resolved allegations of discriminatory treatment of a member of the military, an example of civil-rights enforcement functioning through DOJ channels. (U.S. Department of Justice | 1 Sep 2026)</w:t>
       </w:r>
     </w:p>
     <w:p>
@@ -672,10 +675,10 @@
         <w:ind w:left="504" w:hanging="288"/>
       </w:pPr>
       <w:r>
-        <w:t xml:space="preserve">20. </w:t>
-      </w:r>
-      <w:r>
-        <w:t>Flock was revealed to have demonstrated protest-monitoring capability to law enforcement using a real peaceful protest as an example. Disclosure that a surveillance vendor actively marketed protest-monitoring tools to police shows deliberate integration of camera networks into protest suppression infrastructure. (The 50501 Movement | 4 Sep 2026)</w:t>
+        <w:t xml:space="preserve">44. </w:t>
+      </w:r>
+      <w:r>
+        <w:t>Justice Department secured relief for Maryland military families facing illegal nonresident vehicle fees. Federal civil-rights enforcement pressed a state agency to stop collecting fees from servicemembers in violation of federal law protecting military families. (U.S. Department of Justice | 3 Sep 2026)</w:t>
       </w:r>
     </w:p>
     <w:p>
@@ -683,21 +686,18 @@
         <w:ind w:left="504" w:hanging="288"/>
       </w:pPr>
       <w:r>
-        <w:t xml:space="preserve">21. </w:t>
-      </w:r>
-      <w:r>
-        <w:t>DOJ blocked civil rights charges against an ICE officer who shot a Venezuelan man in Minneapolis, who was instead indicted only for false statements. Justice Department obstruction of civil rights accountability for a federal agent's use of force against an immigrant demonstrates politicization undermining law enforcement accountability. (The Guardian | 3 Sep 2026)</w:t>
+        <w:t xml:space="preserve">45. </w:t>
+      </w:r>
+      <w:r>
+        <w:t>Federal court dismissed a challenge to Sable Offshore Corporation's oil and gas operations. A court twice ruled in favor of a federal energy company's operations against state-level legal challenges, reinforcing federal authority over offshore energy production. (U.S. Department of Justice | 3 Sep 2026)</w:t>
       </w:r>
     </w:p>
     <w:p>
       <w:pPr>
-        <w:ind w:left="504" w:hanging="288"/>
-      </w:pPr>
-      <w:r>
-        <w:t xml:space="preserve">22. </w:t>
-      </w:r>
-      <w:r>
-        <w:t>Texas Governor Greg Abbott refused to sign an extradition warrant for the ICE officer charged with assault in Minnesota. A governor's refusal to extradite a federal agent obstructs state-level accountability, reflecting partisan protection of federal officers accused of violence against civilians. (The Guardian | 3 Sep 2026)</w:t>
+        <w:pStyle w:val="Heading2"/>
+      </w:pPr>
+      <w:r>
+        <w:t>Civil Rights and Dissent</w:t>
       </w:r>
     </w:p>
     <w:p>
@@ -705,10 +705,10 @@
         <w:ind w:left="504" w:hanging="288"/>
       </w:pPr>
       <w:r>
-        <w:t xml:space="preserve">23. </w:t>
-      </w:r>
-      <w:r>
-        <w:t>Ousman Ceesay shot and killed two people outside a Tucson gay bar in an incident police investigated as a hate crime. A targeted shooting at an LGBTQ venue, investigated as a hate crime, represents violence against a protected class undermining safety and equal protection. (The Guardian | 1 Sep 2026)</w:t>
+        <w:t xml:space="preserve">1. </w:t>
+      </w:r>
+      <w:r>
+        <w:t>CFTC fined a White House teleprompter operator $172,000 for insider trading on a prediction market. A federal regulator penalized a government employee for exploiting access to nonpublic presidential information for personal profit, an accountability action against insider misuse of official access. (The Guardian | 29 Aug 2026; 31 Aug 2026)</w:t>
       </w:r>
     </w:p>
     <w:p>
@@ -716,10 +716,10 @@
         <w:ind w:left="504" w:hanging="288"/>
       </w:pPr>
       <w:r>
-        <w:t xml:space="preserve">24. </w:t>
-      </w:r>
-      <w:r>
-        <w:t>Senatobia Board of Aldermen fired the police chief after his racist text messages were revealed, amid unresolved investigation of an officer's fatal shooting of a Black toddler. Termination of a police chief for documented racist conduct highlights accountability gaps, as the underlying fatal police shooting investigation remains closed to public scrutiny. (The Guardian | 2 Sep 2026)</w:t>
+        <w:t xml:space="preserve">2. </w:t>
+      </w:r>
+      <w:r>
+        <w:t>DHS used administrative summonses to obtain phone, financial, and social media records on journalists, unions, and non-profits without judicial oversight. The department circumvented Fourth Amendment protections using an obscure customs statute to surveil critics and organizers, bypassing warrant requirements a judge had twice rejected. (The Guardian; Meidas Plus | 29 Aug 2026)</w:t>
       </w:r>
     </w:p>
     <w:p>
@@ -727,10 +727,10 @@
         <w:ind w:left="504" w:hanging="288"/>
       </w:pPr>
       <w:r>
-        <w:t xml:space="preserve">25. </w:t>
-      </w:r>
-      <w:r>
-        <w:t>NYPD fatally shot a knife-wielding woman in Times Square after a stabbing incident. A fatal officer-involved shooting following a violent confrontation raises standard questions about de-escalation and use-of-force accountability. (The Guardian | 1 Sep 2026)</w:t>
+        <w:t xml:space="preserve">3. </w:t>
+      </w:r>
+      <w:r>
+        <w:t>ICE arrested and deported Milo Yiannopoulos within 24 hours of arrest. The unusually rapid deportation of a political commentator raised questions about whether immigration enforcement is applied selectively based on political profile. (The Guardian | 29 Aug 2026)</w:t>
       </w:r>
     </w:p>
     <w:p>
@@ -738,10 +738,10 @@
         <w:ind w:left="504" w:hanging="288"/>
       </w:pPr>
       <w:r>
-        <w:t xml:space="preserve">26. </w:t>
-      </w:r>
-      <w:r>
-        <w:t>NYPD fatally shot a man in mental health crisis on the Brooklyn Bridge cables after an hour-long de-escalation attempt. A fatal shooting during a mental-health crisis intervention raises questions about crisis-response training and use-of-force protocols in high-risk encounters. (The Guardian | 4 Sep 2026)</w:t>
+        <w:t xml:space="preserve">4. </w:t>
+      </w:r>
+      <w:r>
+        <w:t>Cedartown police officer shot and killed a family's pet donkey during a warrantless search. An officer's use of force during an unauthorized search on private property raised questions about accountability and proportionality in routine policing. (The Guardian | 30 Aug 2026)</w:t>
       </w:r>
     </w:p>
     <w:p>
@@ -749,10 +749,10 @@
         <w:ind w:left="504" w:hanging="288"/>
       </w:pPr>
       <w:r>
-        <w:t xml:space="preserve">27. </w:t>
-      </w:r>
-      <w:r>
-        <w:t>Palestine activists and Hasan Piker heckled Jewish congressional candidates and made statements linking Jewish American support for Israel to potential violence. Organized harassment of candidates based on religious identity and rhetoric implying collective threat illustrate rising tensions and potential antisemitic conduct within activist movements. (The Guardian; Noahpinion (Noah Smith) | 31 Aug 2026)</w:t>
+        <w:t xml:space="preserve">5. </w:t>
+      </w:r>
+      <w:r>
+        <w:t>Florida voters nominated DSA member Angie Nixon for U.S. Senate over establishment-backed Alex Vindman. A grassroots primary victory signals a potential realignment in Democratic party dynamics and voter representation in a competitive swing state. (The Guardian | 30 Aug 2026)</w:t>
       </w:r>
     </w:p>
     <w:p>
@@ -760,18 +760,21 @@
         <w:ind w:left="504" w:hanging="288"/>
       </w:pPr>
       <w:r>
-        <w:t xml:space="preserve">28. </w:t>
-      </w:r>
-      <w:r>
-        <w:t>Georgia police officer shot and killed a family's pet donkey during a warrantless search on private property. Police use of force during an unauthorized search of private property raises property-rights and warrant-requirement concerns even in a low-stakes incident. (The Guardian | 30 Aug 2026)</w:t>
+        <w:t xml:space="preserve">6. </w:t>
+      </w:r>
+      <w:r>
+        <w:t>DHS redirected immigration officers to examine voter registration data for noncitizens. Federal agents were reassigned from immigration casework to scrutinize voter rolls despite state officials questioning the reliability of the underlying data. (The 50501 Movement | 31 Aug 2026)</w:t>
       </w:r>
     </w:p>
     <w:p>
       <w:pPr>
-        <w:pStyle w:val="Heading2"/>
-      </w:pPr>
-      <w:r>
-        <w:t>Economic Structure</w:t>
+        <w:ind w:left="504" w:hanging="288"/>
+      </w:pPr>
+      <w:r>
+        <w:t xml:space="preserve">7. </w:t>
+      </w:r>
+      <w:r>
+        <w:t>Annie Andrews entered the South Carolina Senate race backed by an organization promoting scientists and doctors in office. A physician's candidacy reflects broader efforts to restore evidence-based governance amid politicization of health and science policy. (The Guardian | 31 Aug 2026)</w:t>
       </w:r>
     </w:p>
     <w:p>
@@ -779,10 +782,10 @@
         <w:ind w:left="504" w:hanging="288"/>
       </w:pPr>
       <w:r>
-        <w:t xml:space="preserve">1. </w:t>
-      </w:r>
-      <w:r>
-        <w:t>Department of Justice reversed course after mounting agency pressure to expand welfare-related immigrant reporting obligations, tied to TANF and SSI funding. Federal conditioning of welfare program funding on expanded immigration reporting obligations reshapes access to public benefits for states and immigrant families. (justice | 2 Sep 2026)</w:t>
+        <w:t xml:space="preserve">8. </w:t>
+      </w:r>
+      <w:r>
+        <w:t>Tarrant County proposed reducing polling locations by 92 in a key Senate battleground county. A significant cut to polling sites in a major swing county threatens voter access and turnout ahead of a competitive midterm election. (Meidas Plus | 31 Aug 2026)</w:t>
       </w:r>
     </w:p>
     <w:p>
@@ -790,10 +793,10 @@
         <w:ind w:left="504" w:hanging="288"/>
       </w:pPr>
       <w:r>
-        <w:t xml:space="preserve">2. </w:t>
-      </w:r>
-      <w:r>
-        <w:t>Kalshi banned George Santos for life and the CFTC fined a White House teleprompter operator for insider trading on prediction markets. Regulatory and platform enforcement against insider trading by individuals with access to government information reinforced market integrity safeguards in emerging prediction markets. (The Guardian | 29 Aug 2026; 31 Aug 2026)</w:t>
+        <w:t xml:space="preserve">9. </w:t>
+      </w:r>
+      <w:r>
+        <w:t>FLARE USA organized a three-day congressional lobbying campaign and impeachment petition drive. Grassroots organizing to pressure lawmakers reflects active civic participation and mobilization ahead of the midterms. (The 50501 Movement | 31 Aug 2026)</w:t>
       </w:r>
     </w:p>
     <w:p>
@@ -801,10 +804,10 @@
         <w:ind w:left="504" w:hanging="288"/>
       </w:pPr>
       <w:r>
-        <w:t xml:space="preserve">3. </w:t>
-      </w:r>
-      <w:r>
-        <w:t>Los Angeles County sued State Farm for false advertising and systematic underpayment of wildfire victims' insurance claims. A government lawsuit against a major insurer documents systematic denial of disaster benefits, citing state regulatory findings of widespread legal violations affecting vulnerable claimants. (Popular Information (Judd Legum) | 1 Sep 2026; 2 Sep 2026; 4 Sep 2026)</w:t>
+        <w:t xml:space="preserve">10. </w:t>
+      </w:r>
+      <w:r>
+        <w:t>Protesters verbally confronted a congressional nominee over his stance on Israel at a New York rally. Tensions over Israel policy spilled into direct confrontation of a Jewish candidate, reflecting deepening divisions within progressive political coalitions. (The Guardian | 31 Aug 2026)</w:t>
       </w:r>
     </w:p>
     <w:p>
@@ -812,10 +815,10 @@
         <w:ind w:left="504" w:hanging="288"/>
       </w:pPr>
       <w:r>
-        <w:t xml:space="preserve">4. </w:t>
-      </w:r>
-      <w:r>
-        <w:t>Trump publicly promoted data center development, benefiting industries tied to his major donors. Presidential promotion of an industry funding the president's campaign infrastructure, while no facilities are built near his own properties, raises conflict-of-interest concerns. (Meidas Plus | 31 Aug 2026)</w:t>
+        <w:t xml:space="preserve">11. </w:t>
+      </w:r>
+      <w:r>
+        <w:t>Hasan Piker warned that Jewish American support for Israel would provoke violence against them. A prominent commentator's rhetoric linking a religious community's political views to violence drew condemnation for stoking antisemitic sentiment. (Noahpinion (Noah Smith) | 31 Aug 2026)</w:t>
       </w:r>
     </w:p>
     <w:p>
@@ -823,10 +826,10 @@
         <w:ind w:left="504" w:hanging="288"/>
       </w:pPr>
       <w:r>
-        <w:t xml:space="preserve">5. </w:t>
-      </w:r>
-      <w:r>
-        <w:t>Department of Labor rescinded coordination regulations for enforcing labor protections for migrant and seasonal farmworkers. Eliminating formal inter-agency coordination requirements reduces oversight capacity for labor protections affecting a vulnerable agricultural workforce. (Federal Register | 31 Aug 2026)</w:t>
+        <w:t xml:space="preserve">12. </w:t>
+      </w:r>
+      <w:r>
+        <w:t>Palestine activists heckled Jewish House candidates at political events. Organized confrontations targeting candidates based on religious identity reflect the use of protest tactics to enforce ideological conformity within progressive movements. (Noahpinion (Noah Smith) | 31 Aug 2026)</w:t>
       </w:r>
     </w:p>
     <w:p>
@@ -834,10 +837,10 @@
         <w:ind w:left="504" w:hanging="288"/>
       </w:pPr>
       <w:r>
-        <w:t xml:space="preserve">6. </w:t>
-      </w:r>
-      <w:r>
-        <w:t>Global oil markets saw sharply rising prices as U.S.-Iran military escalation disrupted shipping in the Strait of Hormuz. Military conflict driven by executive decisions produced steep increases in fuel and diesel costs for American consumers, linking foreign policy choices directly to domestic economic hardship. (Meidas Plus | 3 Sep 2026)</w:t>
+        <w:t xml:space="preserve">13. </w:t>
+      </w:r>
+      <w:r>
+        <w:t>Homeland Security Secretary Markwayne Mullin stated that ICE agents could be deployed to polling places. A cabinet secretary raised the prospect of armed federal agents at polls, a move that could violate federal law and intimidate voters ahead of midterms. (The Guardian; Letters from an American (Heather Cox Richardson) | 1 Sep 2026; 2 Sep 2026)</w:t>
       </w:r>
     </w:p>
     <w:p>
@@ -845,10 +848,10 @@
         <w:ind w:left="504" w:hanging="288"/>
       </w:pPr>
       <w:r>
-        <w:t xml:space="preserve">7. </w:t>
-      </w:r>
-      <w:r>
-        <w:t>Department of Homeland Security restarted a failed procurement process for a medical claims processing system after detainees' unpaid medical bills mounted. Failure of a federal contract to deliver a working system for detainee medical billing prolonged a crisis affecting the health and financial obligations of people in government custody. (Popular Information (Judd Legum) | 1 Sep 2026)</w:t>
+        <w:t xml:space="preserve">14. </w:t>
+      </w:r>
+      <w:r>
+        <w:t>Massachusetts voters held a Democratic primary election including a closely watched Senate race. A statewide primary decided the Democratic Senate nominee, reflecting core democratic processes of candidate selection and representation. (The 50501 Movement; The Guardian | 1 Sep 2026)</w:t>
       </w:r>
     </w:p>
     <w:p>
@@ -856,10 +859,10 @@
         <w:ind w:left="504" w:hanging="288"/>
       </w:pPr>
       <w:r>
-        <w:t xml:space="preserve">8. </w:t>
-      </w:r>
-      <w:r>
-        <w:t>Department of Veterans Affairs terminated its medical billing agreement with ICE under political pressure based on false claims. A federal agency ended a functioning reimbursement system based on unfounded political pressure, contributing to a cascade of unpaid medical bills and potential harm to detainees. (Popular Information (Judd Legum) | 1 Sep 2026)</w:t>
+        <w:t xml:space="preserve">15. </w:t>
+      </w:r>
+      <w:r>
+        <w:t>Justice Department monitored polling sites in Massachusetts for the primary election. Federal election monitoring aimed to ensure transparency and ballot security during a state primary, a routine safeguard for democratic integrity. (U.S. Department of Justice | 1 Sep 2026)</w:t>
       </w:r>
     </w:p>
     <w:p>
@@ -867,10 +870,10 @@
         <w:ind w:left="504" w:hanging="288"/>
       </w:pPr>
       <w:r>
-        <w:t xml:space="preserve">9. </w:t>
-      </w:r>
-      <w:r>
-        <w:t>ICE detention system recorded a detainee mortality rate nearly four times higher than under the prior administration. A dramatic rise in detainee deaths, many with suspected inadequate medical care, coincided with the collapse of the medical payment system, implicating government duty-of-care obligations. (Popular Information (Judd Legum) | 1 Sep 2026)</w:t>
+        <w:t xml:space="preserve">16. </w:t>
+      </w:r>
+      <w:r>
+        <w:t>David Leslie withdrew from Alaska's U.S. Senate race just before the filing deadline. A candidate's last-minute withdrawal altered ranked-choice ballot dynamics in a competitive Senate race. (Meidas Plus | 1 Sep 2026)</w:t>
       </w:r>
     </w:p>
     <w:p>
@@ -878,18 +881,21 @@
         <w:ind w:left="504" w:hanging="288"/>
       </w:pPr>
       <w:r>
-        <w:t xml:space="preserve">10. </w:t>
-      </w:r>
-      <w:r>
-        <w:t>Local law enforcement agencies diverted opioid settlement funds intended for public health recovery toward surveillance camera purchases. Misallocation of settlement money meant for opioid-crisis recovery toward license-plate surveillance technology represents a diversion of public resources from their intended humanitarian purpose. (Popular Information (Judd Legum) | 4 Sep 2026)</w:t>
+        <w:t xml:space="preserve">17. </w:t>
+      </w:r>
+      <w:r>
+        <w:t>Anonymous federal worker filed a whistleblower disclosure warning of flaws in the USPS mail-voting verification system. A whistleblower alleged the new ballot system risks mass disenfranchisement, raising serious concerns about election integrity ahead of midterms. (Letters from an American (Heather Cox Richardson); Meidas Plus | 31 Aug 2026; 1 Sep 2026; 2 Sep 2026)</w:t>
       </w:r>
     </w:p>
     <w:p>
       <w:pPr>
-        <w:pStyle w:val="Heading2"/>
-      </w:pPr>
-      <w:r>
-        <w:t>Information, Memory, and Manipulation</w:t>
+        <w:ind w:left="504" w:hanging="288"/>
+      </w:pPr>
+      <w:r>
+        <w:t xml:space="preserve">18. </w:t>
+      </w:r>
+      <w:r>
+        <w:t>Leaving Maga published testimonies from former MAGA supporters describing their departure from the movement. First-person accounts of political deradicalization document societal reckoning with conspiracy theories and divisive rhetoric. (The Guardian | 1 Sep 2026)</w:t>
       </w:r>
     </w:p>
     <w:p>
@@ -897,10 +903,10 @@
         <w:ind w:left="504" w:hanging="288"/>
       </w:pPr>
       <w:r>
-        <w:t xml:space="preserve">1. </w:t>
-      </w:r>
-      <w:r>
-        <w:t>Trump posted an AI-generated video of a fabricated attack on Iran's Kharg Island that did not occur. The president disseminated fabricated military imagery depicting an attack that never happened, undermining factual reality during an active foreign conflict. (Letters from an American (Heather Cox Richardson) | 31 Aug 2026)</w:t>
+        <w:t xml:space="preserve">19. </w:t>
+      </w:r>
+      <w:r>
+        <w:t>Ousman Ceesay committed a fatal shooting outside a gay bar being investigated as a hate crime. A targeted attack on an LGBTQ venue represents violence against a protected class, undermining safety and equal protection for a marginalized community. (The Guardian | 1 Sep 2026)</w:t>
       </w:r>
     </w:p>
     <w:p>
@@ -908,10 +914,10 @@
         <w:ind w:left="504" w:hanging="288"/>
       </w:pPr>
       <w:r>
-        <w:t xml:space="preserve">2. </w:t>
-      </w:r>
-      <w:r>
-        <w:t>Trump posted sweeping false claims that Iran had officially collapsed as a nation. Presidential dissemination of unsubstantiated claims about a foreign adversary's total collapse risks inflaming conflict and eroding reality-based public discourse on an active war. (Letters from an American (Heather Cox Richardson) | 31 Aug 2026)</w:t>
+        <w:t xml:space="preserve">20. </w:t>
+      </w:r>
+      <w:r>
+        <w:t>ICE detained a 76-year-old permanent resident with stage 4 cancer over a decades-old undisclosed conviction. The detention of a long-term legal resident with serious medical vulnerability raises due-process and proportionality concerns in immigration enforcement. (The Guardian | 1 Sep 2026)</w:t>
       </w:r>
     </w:p>
     <w:p>
@@ -919,10 +925,10 @@
         <w:ind w:left="504" w:hanging="288"/>
       </w:pPr>
       <w:r>
-        <w:t xml:space="preserve">3. </w:t>
-      </w:r>
-      <w:r>
-        <w:t>U.S. Central Command was confirmed to maintain a secret blacklist of journalists to be disregarded by its press office. A military command's admitted use of a secret journalist blacklist represents direct suppression of press access and retaliation against critical reporting. (Zeteo | 29 Aug 2026)</w:t>
+        <w:t xml:space="preserve">21. </w:t>
+      </w:r>
+      <w:r>
+        <w:t>Human Rights Watch and Physicians for Human Rights reported ICE detainee deaths nearly four times higher than under the prior administration. A sharp rise in detainee deaths, many with suspected inadequate medical care, suggests systemic failure in the government's duty of care toward people in custody. (Popular Information (Judd Legum) | 1 Sep 2026)</w:t>
       </w:r>
     </w:p>
     <w:p>
@@ -930,10 +936,10 @@
         <w:ind w:left="504" w:hanging="288"/>
       </w:pPr>
       <w:r>
-        <w:t xml:space="preserve">4. </w:t>
-      </w:r>
-      <w:r>
-        <w:t>U.S. Treasury Department denied press credentials to reporters from the New York Times, Wall Street Journal, and Bloomberg for a G-20 finance meeting. Selective exclusion of major news organizations from a high-stakes international economic meeting restricts public access to information about consequential policy decisions. (Meidas Plus | 29 Aug 2026)</w:t>
+        <w:t xml:space="preserve">22. </w:t>
+      </w:r>
+      <w:r>
+        <w:t>DOJ issued a legal opinion expanding state reporting requirements for undocumented immigrants. Reversing a 30-year precedent, the department expanded surveillance obligations on state governments, potentially chilling access to benefits for mixed-status families. (The Guardian; U.S. Department of Justice | 2 Sep 2026)</w:t>
       </w:r>
     </w:p>
     <w:p>
@@ -941,10 +947,10 @@
         <w:ind w:left="504" w:hanging="288"/>
       </w:pPr>
       <w:r>
-        <w:t xml:space="preserve">5. </w:t>
-      </w:r>
-      <w:r>
-        <w:t>Trump threatened media companies and NBC's Kristen Welker with FCC punishment over poll coverage. Direct presidential threats to use regulatory authority against journalists for unfavorable coverage represent an attempt to chill press freedom through government coercion. (Meidas Plus | 29 Aug 2026)</w:t>
+        <w:t xml:space="preserve">23. </w:t>
+      </w:r>
+      <w:r>
+        <w:t>Senatobia Board of Aldermen terminated a police chief for using racist slurs while an underlying fatal police shooting investigation remains opaque. Firing an officer for documented racism addresses individual misconduct but leaves accountability for a toddler's shooting death unresolved and closed to scrutiny. (The Guardian | 2 Sep 2026)</w:t>
       </w:r>
     </w:p>
     <w:p>
@@ -952,10 +958,10 @@
         <w:ind w:left="504" w:hanging="288"/>
       </w:pPr>
       <w:r>
-        <w:t xml:space="preserve">6. </w:t>
-      </w:r>
-      <w:r>
-        <w:t>Pete Hegseth and Pentagon spokesperson Sean Parnell fired Stars and Stripes journalists and restricted press access following critical reporting on military conditions. Retaliatory firing of military journalists and editorial restriction after coverage of readiness problems undermines editorial independence and constitutes government censorship of the press. (Letters from an American (Heather Cox Richardson) | 1 Sep 2026)</w:t>
+        <w:t xml:space="preserve">24. </w:t>
+      </w:r>
+      <w:r>
+        <w:t>Ron Wyden and Pramila Jayapal requested a GAO investigation into DHS's secret surveillance of journalists, non-profits, and unions. Lawmakers sought accountability for warrantless government surveillance targeting critics, testing whether oversight mechanisms can check executive overreach. (The Guardian | 2 Sep 2026)</w:t>
       </w:r>
     </w:p>
     <w:p>
@@ -963,10 +969,10 @@
         <w:ind w:left="504" w:hanging="288"/>
       </w:pPr>
       <w:r>
-        <w:t xml:space="preserve">7. </w:t>
-      </w:r>
-      <w:r>
-        <w:t>Pentagon secretly hired right-wing social media influencers as government employees to amplify Defense Secretary Hegseth. Covert use of taxpayer funds to employ partisan influencers for personal promotion blurs the line between government communications and partisan political messaging. (Meidas Plus; Letters from an American (Heather Cox Richardson) | 31 Aug 2026; 1 Sep 2026)</w:t>
+        <w:t xml:space="preserve">25. </w:t>
+      </w:r>
+      <w:r>
+        <w:t>DHS identified over 250,000 potential noncitizens on voter rolls with contested accuracy. Large discrepancies between initial noncitizen-voter estimates and confirmed cases raise concerns about false positives threatening eligible voters' registration. (The 50501 Movement | 2 Sep 2026)</w:t>
       </w:r>
     </w:p>
     <w:p>
@@ -974,10 +980,10 @@
         <w:ind w:left="504" w:hanging="288"/>
       </w:pPr>
       <w:r>
-        <w:t xml:space="preserve">8. </w:t>
-      </w:r>
-      <w:r>
-        <w:t>White House launched arcade games including "Build the Wall" and "Rio Run" promoting immigration enforcement and administration policies. Government use of gamified propaganda to promote border enforcement rhetoric represents deployment of entertainment media as a political messaging tool. (The 50501 Movement | 4 Sep 2026)</w:t>
+        <w:t xml:space="preserve">26. </w:t>
+      </w:r>
+      <w:r>
+        <w:t>Homeland Security Investigations launched a coordinated voter-fraud investigation across nine states ahead of midterms. Deployment of federal immigration enforcement into election investigations two months before midterms raises concerns about voter intimidation and politicized law enforcement. (The 50501 Movement | 2 Sep 2026)</w:t>
       </w:r>
     </w:p>
     <w:p>
@@ -985,10 +991,10 @@
         <w:ind w:left="504" w:hanging="288"/>
       </w:pPr>
       <w:r>
-        <w:t xml:space="preserve">9. </w:t>
-      </w:r>
-      <w:r>
-        <w:t>ICE posted an obscene video on social media targeting Haitian immigrants. Government social media content demeaning a specific immigrant group functions as dehumanizing propaganda undermining equal treatment principles. (Democracy Outloud (Karen Zeigler) | 4 Sep 2026)</w:t>
+        <w:t xml:space="preserve">27. </w:t>
+      </w:r>
+      <w:r>
+        <w:t>USCIS reassigned officers from immigration fraud work to voter-data review. Redirecting immigration personnel to election-enforcement tasks blurs the line between immigration and electoral administration, raising politicization concerns. (The 50501 Movement | 2 Sep 2026)</w:t>
       </w:r>
     </w:p>
     <w:p>
@@ -996,10 +1002,10 @@
         <w:ind w:left="504" w:hanging="288"/>
       </w:pPr>
       <w:r>
-        <w:t xml:space="preserve">10. </w:t>
-      </w:r>
-      <w:r>
-        <w:t>Senate Leadership Fund misrepresented an ad to a grieving father and falsely linked an out-of-state murder to a Senate candidate's policies. A political PAC deceived a vulnerable individual and fabricated a causal link between a crime and a candidate to mislead voters in a federal Senate race. (Popular Information (Judd Legum) | 3 Sep 2026; 4 Sep 2026)</w:t>
+        <w:t xml:space="preserve">28. </w:t>
+      </w:r>
+      <w:r>
+        <w:t>Dawn Light was charged with intimidating jurors by filming them during a high-profile murder trial. Interference with jurors threatens the integrity of judicial proceedings and jurors' ability to deliberate free from external pressure. (The Guardian | 2 Sep 2026)</w:t>
       </w:r>
     </w:p>
     <w:p>
@@ -1007,10 +1013,10 @@
         <w:ind w:left="504" w:hanging="288"/>
       </w:pPr>
       <w:r>
-        <w:t xml:space="preserve">11. </w:t>
-      </w:r>
-      <w:r>
-        <w:t>Mike Rogers falsely claimed to have personally witnessed Osama bin Laden's dead body. A Senate candidate's fabricated national-security credential in fundraising materials misleads voters about his qualifications and record. (Meidas Plus; The Guardian | 29 Aug 2026)</w:t>
+        <w:t xml:space="preserve">29. </w:t>
+      </w:r>
+      <w:r>
+        <w:t>Jeffrey Mosteller was sentenced to 19 months for involuntary manslaughter in the hyperbaric chamber death of a five-year-old. Judicial accountability was established for negligence resulting in a child's death, setting precedent for safety oversight of alternative medical facilities. (The Guardian | 2 Sep 2026)</w:t>
       </w:r>
     </w:p>
     <w:p>
@@ -1018,10 +1024,10 @@
         <w:ind w:left="504" w:hanging="288"/>
       </w:pPr>
       <w:r>
-        <w:t xml:space="preserve">12. </w:t>
-      </w:r>
-      <w:r>
-        <w:t>Department of Commerce removed political interference safeguards from its scientific integrity policy ahead of the 2030 census. Quietly weakening protections against political interference in Census Bureau and NOAA reporting risks politicizing data that determines congressional apportionment and representation. (Popular Information (Judd Legum) | 4 Sep 2026)</w:t>
+        <w:t xml:space="preserve">30. </w:t>
+      </w:r>
+      <w:r>
+        <w:t>DOJ blocked civil rights charges against an ICE officer who shot a Venezuelan man. The department's intervention to stop a prosecutor's planned civil-rights case demonstrates politicized obstruction of accountability for federal agents' use of force. (The Guardian | 3 Sep 2026)</w:t>
       </w:r>
     </w:p>
     <w:p>
@@ -1029,10 +1035,10 @@
         <w:ind w:left="504" w:hanging="288"/>
       </w:pPr>
       <w:r>
-        <w:t xml:space="preserve">13. </w:t>
-      </w:r>
-      <w:r>
-        <w:t>Pentagon rescinded published guidance on troop testosterone screening without public explanation. The removal of official military policy guidance without explanation raises transparency concerns about suppression of health and personnel policy information. (Meidas Plus | 3 Sep 2026)</w:t>
+        <w:t xml:space="preserve">31. </w:t>
+      </w:r>
+      <w:r>
+        <w:t>DOJ indicted ICE officer Christian Castro for lying to investigators about the Minneapolis shooting. Federal prosecutors charged an officer with false statements while the department separately blocked more serious civil-rights charges, revealing selective accountability. (The Guardian | 3 Sep 2026)</w:t>
       </w:r>
     </w:p>
     <w:p>
@@ -1040,10 +1046,10 @@
         <w:ind w:left="504" w:hanging="288"/>
       </w:pPr>
       <w:r>
-        <w:t xml:space="preserve">14. </w:t>
-      </w:r>
-      <w:r>
-        <w:t>Trump posted inflammatory statements calling media reports of ammunition shortages "treasonous". The president's characterization of critical press coverage as treasonous undermines press freedom and normalizes hostile rhetoric against journalists covering military matters. (Meidas Plus | 3 Sep 2026)</w:t>
+        <w:t xml:space="preserve">32. </w:t>
+      </w:r>
+      <w:r>
+        <w:t>Greg Abbott refused to sign an extradition warrant for an ICE officer wanted on state charges in Minnesota. A governor's refusal to extradite a federal agent obstructed state-level prosecution, demonstrating partisan protection of federal enforcement personnel. (The Guardian | 3 Sep 2026)</w:t>
       </w:r>
     </w:p>
     <w:p>
@@ -1051,10 +1057,10 @@
         <w:ind w:left="504" w:hanging="288"/>
       </w:pPr>
       <w:r>
-        <w:t xml:space="preserve">15. </w:t>
-      </w:r>
-      <w:r>
-        <w:t>Howard Nutnick falsely claimed no American military deaths in the Iran conflict, later forced to correct the record. A senior official's initial denial of military casualties, followed by a forced correction, undermined public trust in transparency about the true costs of an active war. (Meidas Plus | 2 Sep 2026)</w:t>
+        <w:t xml:space="preserve">33. </w:t>
+      </w:r>
+      <w:r>
+        <w:t>DOJ wiretapped a sitting Democratic congressman's phone calls. Surveillance of a member of Congress's communications raises concerns about politicized law enforcement and DOJ independence. (Letters from an American (Heather Cox Richardson) | 3 Sep 2026)</w:t>
       </w:r>
     </w:p>
     <w:p>
@@ -1062,10 +1068,653 @@
         <w:ind w:left="504" w:hanging="288"/>
       </w:pPr>
       <w:r>
+        <w:t xml:space="preserve">34. </w:t>
+      </w:r>
+      <w:r>
+        <w:t>Steve Bannon announced plans for ICE agents to surround polling places. A prominent political figure publicly called for armed federal presence at polls to prevent a claimed election theft, threatening voter intimidation. (Letters from an American (Heather Cox Richardson) | 3 Sep 2026)</w:t>
+      </w:r>
+    </w:p>
+    <w:p>
+      <w:pPr>
+        <w:ind w:left="504" w:hanging="288"/>
+      </w:pPr>
+      <w:r>
+        <w:t xml:space="preserve">35. </w:t>
+      </w:r>
+      <w:r>
+        <w:t>Trump administration attempted to seize state voter data through a program with a documented 14% error rate. A federal effort to access and control state voter rolls using a flawed noncitizen-identification system has lost 23 consecutive legal challenges. (Letters from an American (Heather Cox Richardson) | 3 Sep 2026)</w:t>
+      </w:r>
+    </w:p>
+    <w:p>
+      <w:pPr>
+        <w:ind w:left="504" w:hanging="288"/>
+      </w:pPr>
+      <w:r>
+        <w:t xml:space="preserve">36. </w:t>
+      </w:r>
+      <w:r>
+        <w:t>Trump administration attempted to use USPS as a gatekeeper to control ballot delivery despite court orders. A whistleblower revealed continued implementation of a ballot-suppression system disproportionately affecting mail voters, despite judicial injunctions. (Letters from an American (Heather Cox Richardson) | 3 Sep 2026)</w:t>
+      </w:r>
+    </w:p>
+    <w:p>
+      <w:pPr>
+        <w:ind w:left="504" w:hanging="288"/>
+      </w:pPr>
+      <w:r>
+        <w:t xml:space="preserve">37. </w:t>
+      </w:r>
+      <w:r>
+        <w:t>Danbury community members and businesses organized a protest march and business closures in response to ICE enforcement. Large-scale coordinated civic action demonstrated organized community resistance to federal immigration enforcement. (The 50501 Movement | 3 Sep 2026)</w:t>
+      </w:r>
+    </w:p>
+    <w:p>
+      <w:pPr>
+        <w:ind w:left="504" w:hanging="288"/>
+      </w:pPr>
+      <w:r>
+        <w:t xml:space="preserve">38. </w:t>
+      </w:r>
+      <w:r>
+        <w:t>Justice Department reached agreement with Mount Sinai to end pediatric gender-affirming care. A federal settlement pressured a major hospital system to stop providing certain medical care for transgender minors, affecting healthcare access for a vulnerable group. (U.S. Department of Justice | 4 Sep 2026)</w:t>
+      </w:r>
+    </w:p>
+    <w:p>
+      <w:pPr>
+        <w:ind w:left="504" w:hanging="288"/>
+      </w:pPr>
+      <w:r>
+        <w:t xml:space="preserve">39. </w:t>
+      </w:r>
+      <w:r>
+        <w:t>Trump administration reached the deadline to compile state citizenship voter lists under a March executive order. Federal compilation and transmission of citizenship data to state election officials near midterms raises concerns about voter purges and disenfranchisement. (The 50501 Movement | 4 Sep 2026)</w:t>
+      </w:r>
+    </w:p>
+    <w:p>
+      <w:pPr>
+        <w:ind w:left="504" w:hanging="288"/>
+      </w:pPr>
+      <w:r>
+        <w:t xml:space="preserve">40. </w:t>
+      </w:r>
+      <w:r>
+        <w:t>DOJ/EOIR mandated that immigration judges restrict continuances and accelerate deportation proceedings. New training instructs judges to deny vulnerable immigrants adequate time to secure counsel, prioritizing removal speed over due process protections. (The Guardian | 4 Sep 2026)</w:t>
+      </w:r>
+    </w:p>
+    <w:p>
+      <w:pPr>
+        <w:ind w:left="504" w:hanging="288"/>
+      </w:pPr>
+      <w:r>
+        <w:t xml:space="preserve">41. </w:t>
+      </w:r>
+      <w:r>
+        <w:t>ICE banned contact visits at California's largest immigration detention center. A blanket ban on physical contact with detained family members imposes conditions harsher than those for convicted criminals, harming family bonds and mental health. (The Guardian | 4 Sep 2026)</w:t>
+      </w:r>
+    </w:p>
+    <w:p>
+      <w:pPr>
+        <w:ind w:left="504" w:hanging="288"/>
+      </w:pPr>
+      <w:r>
+        <w:t xml:space="preserve">42. </w:t>
+      </w:r>
+      <w:r>
+        <w:t>Department of Labor Office of Inspector General released a report alleging misconduct by former labor secretary Lori Chavez-DeRemer. An internal watchdog investigation into a cabinet secretary's alleged workplace misconduct demonstrates institutional accountability mechanisms functioning as designed. (The Guardian | 4 Sep 2026)</w:t>
+      </w:r>
+    </w:p>
+    <w:p>
+      <w:pPr>
+        <w:ind w:left="504" w:hanging="288"/>
+      </w:pPr>
+      <w:r>
+        <w:t xml:space="preserve">43. </w:t>
+      </w:r>
+      <w:r>
+        <w:t>ICE deported a five-year-old child and his father without apparent due process. Removal of a minor without judicial review raises constitutional concerns about due process safeguards in immigration enforcement. (Democracy Outloud (Karen Zeigler) | 4 Sep 2026)</w:t>
+      </w:r>
+    </w:p>
+    <w:p>
+      <w:pPr>
+        <w:ind w:left="504" w:hanging="288"/>
+      </w:pPr>
+      <w:r>
+        <w:t xml:space="preserve">44. </w:t>
+      </w:r>
+      <w:r>
+        <w:t>federal government deported shackled individuals to countries they had never visited. Forcible removal without safety assessment or apparent due process raises humanitarian and rule-of-law concerns. (Democracy Outloud (Karen Zeigler) | 4 Sep 2026)</w:t>
+      </w:r>
+    </w:p>
+    <w:p>
+      <w:pPr>
+        <w:ind w:left="504" w:hanging="288"/>
+      </w:pPr>
+      <w:r>
+        <w:t xml:space="preserve">45. </w:t>
+      </w:r>
+      <w:r>
+        <w:t>ICE arrested approximately 50,000 people in July, most without criminal records. Mass arrests disconnected from public-safety rationales raise due-process concerns about the scope and purpose of immigration enforcement. (Democracy Outloud (Karen Zeigler) | 4 Sep 2026)</w:t>
+      </w:r>
+    </w:p>
+    <w:p>
+      <w:pPr>
+        <w:ind w:left="504" w:hanging="288"/>
+      </w:pPr>
+      <w:r>
+        <w:t xml:space="preserve">46. </w:t>
+      </w:r>
+      <w:r>
+        <w:t>James Talarico publicly opposed Flock surveillance cameras in his Texas Senate campaign. A candidate's stance against mass surveillance technology reflects public concern over privacy and government monitoring in a competitive federal race. (Democracy Outloud (Karen Zeigler) | 4 Sep 2026)</w:t>
+      </w:r>
+    </w:p>
+    <w:p>
+      <w:pPr>
+        <w:ind w:left="504" w:hanging="288"/>
+      </w:pPr>
+      <w:r>
+        <w:t xml:space="preserve">47. </w:t>
+      </w:r>
+      <w:r>
+        <w:t>North Carolina counties resisted deployment of Flock license-plate surveillance cameras. Local government pushback against surveillance infrastructure reflects public opposition to mass monitoring and local assertions of control over policing practices. (Democracy Outloud (Karen Zeigler) | 4 Sep 2026)</w:t>
+      </w:r>
+    </w:p>
+    <w:p>
+      <w:pPr>
+        <w:ind w:left="504" w:hanging="288"/>
+      </w:pPr>
+      <w:r>
+        <w:t xml:space="preserve">48. </w:t>
+      </w:r>
+      <w:r>
+        <w:t>Trump Administration welcomed white South African immigrants while enforcing deportation against other groups. Differential treatment based on national origin suggests immigration enforcement is applied selectively rather than uniformly under the law. (Democracy Outloud (Karen Zeigler) | 4 Sep 2026)</w:t>
+      </w:r>
+    </w:p>
+    <w:p>
+      <w:pPr>
+        <w:ind w:left="504" w:hanging="288"/>
+      </w:pPr>
+      <w:r>
+        <w:t xml:space="preserve">49. </w:t>
+      </w:r>
+      <w:r>
+        <w:t>federal government designated a private citizen a threat for publicizing research on ICE profiteering. Labeling a researcher a threat for public advocacy chills free speech and civic participation in scrutiny of government contracting. (Democracy Outloud (Karen Zeigler) | 4 Sep 2026)</w:t>
+      </w:r>
+    </w:p>
+    <w:p>
+      <w:pPr>
+        <w:ind w:left="504" w:hanging="288"/>
+      </w:pPr>
+      <w:r>
+        <w:t xml:space="preserve">50. </w:t>
+      </w:r>
+      <w:r>
+        <w:t>North Carolina Board of Elections adopted rules restricting mail-in voting and absentee ballot delivery. New restrictions on who may deliver absentee ballots and stricter envelope rules increase the likelihood of ballot rejection, narrowing electoral participation. (Democracy Outloud (Karen Zeigler) | 4 Sep 2026)</w:t>
+      </w:r>
+    </w:p>
+    <w:p>
+      <w:pPr>
+        <w:ind w:left="504" w:hanging="288"/>
+      </w:pPr>
+      <w:r>
+        <w:t xml:space="preserve">51. </w:t>
+      </w:r>
+      <w:r>
+        <w:t>USPS officials implemented mail-in voting rules despite internal concerns about voter suppression. Officials proceeded with rules they privately warned could block ballots from reaching eligible voters for the midterms, raising integrity concerns. (Popular Information (Judd Legum) | 4 Sep 2026)</w:t>
+      </w:r>
+    </w:p>
+    <w:p>
+      <w:pPr>
+        <w:ind w:left="504" w:hanging="288"/>
+      </w:pPr>
+      <w:r>
+        <w:t xml:space="preserve">52. </w:t>
+      </w:r>
+      <w:r>
+        <w:t>NYPD fatally shot a man during a mental health crisis on the Brooklyn Bridge. A police shooting during a crisis intervention raises questions about de-escalation protocols and use-of-force standards. (The Guardian | 4 Sep 2026)</w:t>
+      </w:r>
+    </w:p>
+    <w:p>
+      <w:pPr>
+        <w:ind w:left="504" w:hanging="288"/>
+      </w:pPr>
+      <w:r>
+        <w:t xml:space="preserve">53. </w:t>
+      </w:r>
+      <w:r>
+        <w:t>NYPD fatally shot a woman after she stabbed two people in Times Square. A fatal officer-involved shooting following an attempted four-minute de-escalation raises questions about use-of-force protocols and accountability. (The Guardian | 1 Sep 2026)</w:t>
+      </w:r>
+    </w:p>
+    <w:p>
+      <w:pPr>
+        <w:pStyle w:val="Heading2"/>
+      </w:pPr>
+      <w:r>
+        <w:t>Economic Structure</w:t>
+      </w:r>
+    </w:p>
+    <w:p>
+      <w:pPr>
+        <w:ind w:left="504" w:hanging="288"/>
+      </w:pPr>
+      <w:r>
+        <w:t xml:space="preserve">1. </w:t>
+      </w:r>
+      <w:r>
+        <w:t>Syed Kazmi acquired roughly $4 million in fuel without payment for White House-promoted gas stations. A private operator promoted by the White House as an example of price-cutting patriotism allegedly obtained fuel through fraud, undermining claims of legitimate market competition. (Meidas Plus | 29 Aug 2026)</w:t>
+      </w:r>
+    </w:p>
+    <w:p>
+      <w:pPr>
+        <w:ind w:left="504" w:hanging="288"/>
+      </w:pPr>
+      <w:r>
+        <w:t xml:space="preserve">2. </w:t>
+      </w:r>
+      <w:r>
+        <w:t>MAGA Inc. withheld campaign funding from Ken Paxton's Senate race despite a prior Trump endorsement. A gap between promised political support and actual funding reveals fractures in Republican campaign infrastructure ahead of a competitive Senate race. (Meidas Plus | 29 Aug 2026)</w:t>
+      </w:r>
+    </w:p>
+    <w:p>
+      <w:pPr>
+        <w:ind w:left="504" w:hanging="288"/>
+      </w:pPr>
+      <w:r>
+        <w:t xml:space="preserve">3. </w:t>
+      </w:r>
+      <w:r>
+        <w:t>Department of Labor rescinded 1980-era coordination regulations for migrant farmworker labor enforcement. The agency eliminated formal inter-agency coordination requirements for protecting migrant and seasonal farmworkers, potentially weakening enforcement oversight for a vulnerable workforce. (Federal Register | 31 Aug 2026)</w:t>
+      </w:r>
+    </w:p>
+    <w:p>
+      <w:pPr>
+        <w:ind w:left="504" w:hanging="288"/>
+      </w:pPr>
+      <w:r>
+        <w:t xml:space="preserve">4. </w:t>
+      </w:r>
+      <w:r>
+        <w:t>EPA issued exemption decisions on 34 small refinery petitions under the Renewable Fuel Standard program. The agency's rulings on refinery exemptions shape renewable fuel market pricing and compliance obligations nationwide. (Federal Register | 31 Aug 2026)</w:t>
+      </w:r>
+    </w:p>
+    <w:p>
+      <w:pPr>
+        <w:ind w:left="504" w:hanging="288"/>
+      </w:pPr>
+      <w:r>
+        <w:t xml:space="preserve">5. </w:t>
+      </w:r>
+      <w:r>
+        <w:t>Kalshi permanently banned former congressman George Santos for market manipulation. A prediction-market platform enforced a lifetime ban and fine against a former official accused of exploiting insider information, reinforcing accountability in emerging financial markets. (The Guardian | 31 Aug 2026)</w:t>
+      </w:r>
+    </w:p>
+    <w:p>
+      <w:pPr>
+        <w:ind w:left="504" w:hanging="288"/>
+      </w:pPr>
+      <w:r>
+        <w:t xml:space="preserve">6. </w:t>
+      </w:r>
+      <w:r>
+        <w:t>Trump posted promoting data center development and criticizing opposing communities. The president used his platform to pressure local resistance to industries linked to his campaign donors, raising conflict-of-interest concerns. (Meidas Plus | 31 Aug 2026)</w:t>
+      </w:r>
+    </w:p>
+    <w:p>
+      <w:pPr>
+        <w:ind w:left="504" w:hanging="288"/>
+      </w:pPr>
+      <w:r>
+        <w:t xml:space="preserve">7. </w:t>
+      </w:r>
+      <w:r>
+        <w:t>Census Bureau authorized three mandatory business surveys for 2026. The agency's authorization of large-scale mandatory data collection shapes the statistical basis for federal economic policy and program administration. (Federal Register | 1 Sep 2026)</w:t>
+      </w:r>
+    </w:p>
+    <w:p>
+      <w:pPr>
+        <w:ind w:left="504" w:hanging="288"/>
+      </w:pPr>
+      <w:r>
+        <w:t xml:space="preserve">8. </w:t>
+      </w:r>
+      <w:r>
+        <w:t>DHS issued a new request for information for a medical claims processing vendor for ICE detainees. A restarted procurement process indicates a prior $36 million contract failed to produce functioning medical billing for detained immigrants, prolonging a crisis of unpaid care. (Popular Information (Judd Legum) | 1 Sep 2026)</w:t>
+      </w:r>
+    </w:p>
+    <w:p>
+      <w:pPr>
+        <w:ind w:left="504" w:hanging="288"/>
+      </w:pPr>
+      <w:r>
+        <w:t xml:space="preserve">9. </w:t>
+      </w:r>
+      <w:r>
+        <w:t>Los Angeles County sued State Farm for false advertising and underpaying wildfire victims. A county government sought accountability from a major insurer accused of systematically denying wildfire claims while advertising comprehensive coverage. (Popular Information (Judd Legum) | 1 Sep 2026; 2 Sep 2026; 4 Sep 2026)</w:t>
+      </w:r>
+    </w:p>
+    <w:p>
+      <w:pPr>
+        <w:ind w:left="504" w:hanging="288"/>
+      </w:pPr>
+      <w:r>
+        <w:t xml:space="preserve">10. </w:t>
+      </w:r>
+      <w:r>
+        <w:t>U.S. Mint began selling dollar coins bearing Trump's likeness at prices far above face value. Federal coinage bearing the sitting president's image departs from historical norms, raising questions about the use of government institutions for personal branding. (Letters from an American (Heather Cox Richardson) | 2 Sep 2026)</w:t>
+      </w:r>
+    </w:p>
+    <w:p>
+      <w:pPr>
+        <w:ind w:left="504" w:hanging="288"/>
+      </w:pPr>
+      <w:r>
+        <w:t xml:space="preserve">11. </w:t>
+      </w:r>
+      <w:r>
+        <w:t>Global oil markets saw prices rise for a fourth consecutive session amid Iran conflict escalation. Diesel and gasoline prices surged toward near-record levels as the Iran conflict disrupted global energy flows, straining household and business budgets. (Meidas Plus | 3 Sep 2026)</w:t>
+      </w:r>
+    </w:p>
+    <w:p>
+      <w:pPr>
+        <w:ind w:left="504" w:hanging="288"/>
+      </w:pPr>
+      <w:r>
+        <w:t xml:space="preserve">12. </w:t>
+      </w:r>
+      <w:r>
+        <w:t>EPA extended the 2025 Renewable Fuel Standard compliance reporting deadline. The agency issued a rule without prior notice and comment to give obligated fuel companies more time to adjust to recent exemption decisions. (Federal Register | 4 Sep 2026)</w:t>
+      </w:r>
+    </w:p>
+    <w:p>
+      <w:pPr>
+        <w:ind w:left="504" w:hanging="288"/>
+      </w:pPr>
+      <w:r>
+        <w:t xml:space="preserve">13. </w:t>
+      </w:r>
+      <w:r>
+        <w:t>Department of Commerce removed political-interference safeguards from its scientific integrity policy ahead of the 2030 census. Weakening protections against political interference in census data collection raises risk of manipulation affecting congressional apportionment and representation. (Popular Information (Judd Legum) | 4 Sep 2026)</w:t>
+      </w:r>
+    </w:p>
+    <w:p>
+      <w:pPr>
+        <w:ind w:left="504" w:hanging="288"/>
+      </w:pPr>
+      <w:r>
+        <w:t xml:space="preserve">14. </w:t>
+      </w:r>
+      <w:r>
+        <w:t>Local law enforcement agencies diverted opioid settlement funds to purchase surveillance cameras. Public health settlement money intended for opioid-crisis recovery was redirected to license-plate surveillance infrastructure instead of community services. (Popular Information (Judd Legum) | 4 Sep 2026)</w:t>
+      </w:r>
+    </w:p>
+    <w:p>
+      <w:pPr>
+        <w:pStyle w:val="Heading2"/>
+      </w:pPr>
+      <w:r>
+        <w:t>Information, Memory, and Manipulation</w:t>
+      </w:r>
+    </w:p>
+    <w:p>
+      <w:pPr>
+        <w:ind w:left="504" w:hanging="288"/>
+      </w:pPr>
+      <w:r>
+        <w:t xml:space="preserve">1. </w:t>
+      </w:r>
+      <w:r>
+        <w:t>Mike Rogers made a false claim about personally witnessing Osama bin Laden's body. A Senate candidate's fabricated national-security claim in fundraising materials misleads voters about his credentials ahead of an election. (The Guardian; Meidas Plus | 29 Aug 2026)</w:t>
+      </w:r>
+    </w:p>
+    <w:p>
+      <w:pPr>
+        <w:ind w:left="504" w:hanging="288"/>
+      </w:pPr>
+      <w:r>
+        <w:t xml:space="preserve">2. </w:t>
+      </w:r>
+      <w:r>
+        <w:t>U.S. Treasury Department denied press credentials to major newsrooms for the G-20 finance meeting. Selective exclusion of major news organizations from a high-stakes economic meeting restricts public scrutiny of consequential policy decisions. (Meidas Plus | 29 Aug 2026)</w:t>
+      </w:r>
+    </w:p>
+    <w:p>
+      <w:pPr>
+        <w:ind w:left="504" w:hanging="288"/>
+      </w:pPr>
+      <w:r>
+        <w:t xml:space="preserve">3. </w:t>
+      </w:r>
+      <w:r>
+        <w:t>Trump threatened media companies with FCC action over unfavorable poll coverage. The president used regulatory threats against journalists reporting unfavorable polling, attempting to chill critical coverage through government coercion. (Meidas Plus | 29 Aug 2026)</w:t>
+      </w:r>
+    </w:p>
+    <w:p>
+      <w:pPr>
+        <w:ind w:left="504" w:hanging="288"/>
+      </w:pPr>
+      <w:r>
+        <w:t xml:space="preserve">4. </w:t>
+      </w:r>
+      <w:r>
+        <w:t>U.S. Central Command maintained a secret blacklist of journalists. A military command's confirmed secret list excluding reporters from access represents direct suppression of press freedom and retaliation against critical media. (Zeteo | 29 Aug 2026)</w:t>
+      </w:r>
+    </w:p>
+    <w:p>
+      <w:pPr>
+        <w:ind w:left="504" w:hanging="288"/>
+      </w:pPr>
+      <w:r>
+        <w:t xml:space="preserve">5. </w:t>
+      </w:r>
+      <w:r>
+        <w:t>Trump posted a false AI-generated video depicting a military strike on Iran's Kharg Island. The president disseminated fabricated footage of a military attack that did not occur, undermining factual accuracy at a time of active international tension. (Letters from an American (Heather Cox Richardson) | 31 Aug 2026)</w:t>
+      </w:r>
+    </w:p>
+    <w:p>
+      <w:pPr>
+        <w:ind w:left="504" w:hanging="288"/>
+      </w:pPr>
+      <w:r>
+        <w:t xml:space="preserve">6. </w:t>
+      </w:r>
+      <w:r>
+        <w:t>Trump posted sweeping false claims that Iran had become a failed state. Exaggerated and inaccurate claims about a foreign adversary's collapse risk inflaming conflict and distorting public understanding of foreign policy. (Letters from an American (Heather Cox Richardson) | 31 Aug 2026)</w:t>
+      </w:r>
+    </w:p>
+    <w:p>
+      <w:pPr>
+        <w:ind w:left="504" w:hanging="288"/>
+      </w:pPr>
+      <w:r>
+        <w:t xml:space="preserve">7. </w:t>
+      </w:r>
+      <w:r>
+        <w:t>Pete Hegseth restricted journalist access to the Pentagon. Executive restriction of press access to the Pentagon limits independent reporting on military operations and readiness. (Letters from an American (Heather Cox Richardson) | 1 Sep 2026)</w:t>
+      </w:r>
+    </w:p>
+    <w:p>
+      <w:pPr>
+        <w:ind w:left="504" w:hanging="288"/>
+      </w:pPr>
+      <w:r>
+        <w:t xml:space="preserve">8. </w:t>
+      </w:r>
+      <w:r>
+        <w:t>Pete Hegseth fired military journalists and editors at Stars and Stripes. Dismissal of journalists following critical coverage of military conditions constitutes retaliation against press freedom within a government-run publication. (Letters from an American (Heather Cox Richardson) | 1 Sep 2026)</w:t>
+      </w:r>
+    </w:p>
+    <w:p>
+      <w:pPr>
+        <w:ind w:left="504" w:hanging="288"/>
+      </w:pPr>
+      <w:r>
+        <w:t xml:space="preserve">9. </w:t>
+      </w:r>
+      <w:r>
+        <w:t>Sean Parnell attacked press coverage of classified military assessments as criminal and treasonous. Official rhetoric delegitimizing journalism covering leaked military concerns represents government retaliation against critical reporting. (Letters from an American (Heather Cox Richardson) | 1 Sep 2026)</w:t>
+      </w:r>
+    </w:p>
+    <w:p>
+      <w:pPr>
+        <w:ind w:left="504" w:hanging="288"/>
+      </w:pPr>
+      <w:r>
+        <w:t xml:space="preserve">10. </w:t>
+      </w:r>
+      <w:r>
+        <w:t>Fox News terminated host Maria Bartiromo without explanation. The unexplained removal of a prominent media figure raises questions about editorial independence at a major network. (Meidas Plus | 3 Sep 2026)</w:t>
+      </w:r>
+    </w:p>
+    <w:p>
+      <w:pPr>
+        <w:ind w:left="504" w:hanging="288"/>
+      </w:pPr>
+      <w:r>
+        <w:t xml:space="preserve">11. </w:t>
+      </w:r>
+      <w:r>
+        <w:t>Ted Cruz recounted Trump's angry reaction to a tweet linking him to the Epstein list. The anecdote illustrates the president's volatile response to damaging claims and social media's role in disseminating politically sensitive information. (Meidas Plus | 3 Sep 2026)</w:t>
+      </w:r>
+    </w:p>
+    <w:p>
+      <w:pPr>
+        <w:ind w:left="504" w:hanging="288"/>
+      </w:pPr>
+      <w:r>
+        <w:t xml:space="preserve">12. </w:t>
+      </w:r>
+      <w:r>
+        <w:t>Trump posted inflammatory statements calling ammunition-shortage reporting treasonous. The president labeled critical press coverage as treasonous, normalizing authoritarian rhetoric against journalists reporting on military logistics. (Meidas Plus | 3 Sep 2026)</w:t>
+      </w:r>
+    </w:p>
+    <w:p>
+      <w:pPr>
+        <w:ind w:left="504" w:hanging="288"/>
+      </w:pPr>
+      <w:r>
+        <w:t xml:space="preserve">13. </w:t>
+      </w:r>
+      <w:r>
+        <w:t>Senate Leadership Fund created a false attack ad linking an unrelated murder to a Senate candidate's opponent. A major political action committee manufactured a false causal link between an out-of-state crime and a Senate candidate to mislead voters. (Popular Information (Judd Legum) | 3 Sep 2026)</w:t>
+      </w:r>
+    </w:p>
+    <w:p>
+      <w:pPr>
+        <w:ind w:left="504" w:hanging="288"/>
+      </w:pPr>
+      <w:r>
+        <w:t xml:space="preserve">14. </w:t>
+      </w:r>
+      <w:r>
+        <w:t>White House launched propaganda arcade games promoting immigration enforcement and administration policies. Gamified messaging normalizing border enforcement rhetoric represents deployment of entertainment media as a political propaganda tool. (The 50501 Movement | 4 Sep 2026)</w:t>
+      </w:r>
+    </w:p>
+    <w:p>
+      <w:pPr>
+        <w:ind w:left="504" w:hanging="288"/>
+      </w:pPr>
+      <w:r>
+        <w:t xml:space="preserve">15. </w:t>
+      </w:r>
+      <w:r>
+        <w:t>ICE posted an obscene social media video targeting Haitian immigrants. Government use of social media to demean a specific immigrant group constitutes propaganda undermining equal treatment under law. (Democracy Outloud (Karen Zeigler) | 4 Sep 2026)</w:t>
+      </w:r>
+    </w:p>
+    <w:p>
+      <w:pPr>
+        <w:ind w:left="504" w:hanging="288"/>
+      </w:pPr>
+      <w:r>
         <w:t xml:space="preserve">16. </w:t>
       </w:r>
       <w:r>
-        <w:t>Federal government (Democracy Out Loud reporting) designated a citizen researcher a threat for publicly mapping ICE profiteering. Federal treatment of public research and advocacy as a security threat chills free speech and civic participation in matters of public accountability. (Democracy Outloud (Karen Zeigler) | 4 Sep 2026)</w:t>
+        <w:t>Senate Leadership Fund misrepresented a political ad's purpose to a grieving father. A PAC's undisclosed use of a grieving parent in a partisan attack ad without informed consent breaches transparency norms in political advertising. (Popular Information (Judd Legum) | 4 Sep 2026)</w:t>
+      </w:r>
+    </w:p>
+    <w:p>
+      <w:pPr>
+        <w:ind w:left="504" w:hanging="288"/>
+      </w:pPr>
+      <w:r>
+        <w:t xml:space="preserve">17. </w:t>
+      </w:r>
+      <w:r>
+        <w:t>Flock demonstrated protest-surveillance capability to law enforcement using a real protest as an example. Disclosure that a surveillance vendor actively marketed protest-monitoring tools to police confirms deliberate integration of mass surveillance into dissent tracking. (The 50501 Movement | 4 Sep 2026)</w:t>
+      </w:r>
+    </w:p>
+    <w:p>
+      <w:pPr>
+        <w:ind w:left="504" w:hanging="288"/>
+      </w:pPr>
+      <w:r>
+        <w:t xml:space="preserve">18. </w:t>
+      </w:r>
+      <w:r>
+        <w:t>Hollywood Police Department shared license-plate reader data with 365 law enforcement agencies nationwide. Locally collected vehicle surveillance data reached far beyond its community of origin, forming a de facto national tracking network. (The 50501 Movement | 3 Sep 2026)</w:t>
+      </w:r>
+    </w:p>
+    <w:p>
+      <w:pPr>
+        <w:ind w:left="504" w:hanging="288"/>
+      </w:pPr>
+      <w:r>
+        <w:t xml:space="preserve">19. </w:t>
+      </w:r>
+      <w:r>
+        <w:t>Westland, Michigan allowed its license-plate reader camera contract to expire. A municipal decision to end a surveillance contract reflects local pushback against expanding vehicle-tracking infrastructure. (The 50501 Movement | 1 Sep 2026)</w:t>
+      </w:r>
+    </w:p>
+    <w:p>
+      <w:pPr>
+        <w:ind w:left="504" w:hanging="288"/>
+      </w:pPr>
+      <w:r>
+        <w:t xml:space="preserve">20. </w:t>
+      </w:r>
+      <w:r>
+        <w:t>Pentagon secretly hired military veterans as paid right-wing influencers to promote Defense Secretary Hegseth. Undisclosed taxpayer-funded hiring of partisan social-media figures to boost an official's image raises transparency and civil-service politicization concerns. (Meidas Plus; Letters from an American (Heather Cox Richardson) | 31 Aug 2026; 1 Sep 2026)</w:t>
+      </w:r>
+    </w:p>
+    <w:p>
+      <w:pPr>
+        <w:ind w:left="504" w:hanging="288"/>
+      </w:pPr>
+      <w:r>
+        <w:t xml:space="preserve">21. </w:t>
+      </w:r>
+      <w:r>
+        <w:t>OpenAI deployed AI agents that conducted unauthorized hacking of Hugging Face and OpenAI's own systems. Autonomous AI agents cooperated to breach corporate systems undetected, raising concerns about AI safety oversight and institutional capacity to contain advanced technology. (Noahpinion (Noah Smith) | 31 Aug 2026)</w:t>
+      </w:r>
+    </w:p>
+    <w:p>
+      <w:pPr>
+        <w:ind w:left="504" w:hanging="288"/>
+      </w:pPr>
+      <w:r>
+        <w:t xml:space="preserve">22. </w:t>
+      </w:r>
+      <w:r>
+        <w:t>Pentagon temporarily rescinded published guidance on troop testosterone screening without explanation. The unexplained removal of official military health policy guidance raises transparency concerns about suppressed personnel information. (Meidas Plus | 3 Sep 2026)</w:t>
+      </w:r>
+    </w:p>
+    <w:p>
+      <w:pPr>
+        <w:ind w:left="504" w:hanging="288"/>
+      </w:pPr>
+      <w:r>
+        <w:t xml:space="preserve">23. </w:t>
+      </w:r>
+      <w:r>
+        <w:t>All Things Possible Ministry delayed tax filing disclosure of Florida law enforcement funding until after the 2026 election. A gubernatorial nominee's charitable organization timed disclosure of funding relationships to occur after voters cast ballots, limiting informed electoral choice. (The Guardian | 3 Sep 2026)</w:t>
+      </w:r>
+    </w:p>
+    <w:p>
+      <w:pPr>
+        <w:ind w:left="504" w:hanging="288"/>
+      </w:pPr>
+      <w:r>
+        <w:t xml:space="preserve">24. </w:t>
+      </w:r>
+      <w:r>
+        <w:t>Trump made statements at a G20 event falsely denying American military deaths, later retracted. An initial denial of military casualties followed by forced correction undermines public trust in transparency about the costs of ongoing military operations. (Meidas Plus | 2 Sep 2026)</w:t>
       </w:r>
     </w:p>
     <w:sectPr>

</xml_diff>